<commit_message>
Update author name and build table of contents
</commit_message>
<xml_diff>
--- a/Smart_Parking_Platform_Project_Document.docx
+++ b/Smart_Parking_Platform_Project_Document.docx
@@ -105,14 +105,23 @@
     </w:p>
     <w:p>
       <w:pPr>
-        <w:pStyle w:val="Heading2"/>
+        <w:rPr>
+          <w:b/>
+          <w:bCs/>
+          <w:sz w:val="28"/>
+          <w:szCs w:val="28"/>
+        </w:rPr>
       </w:pPr>
       <w:bookmarkStart w:id="1" w:name="document-control"/>
-      <w:bookmarkStart w:id="2" w:name="_Toc239955039"/>
-      <w:r>
+      <w:r>
+        <w:rPr>
+          <w:b/>
+          <w:bCs/>
+          <w:sz w:val="28"/>
+          <w:szCs w:val="28"/>
+        </w:rPr>
         <w:t>Document Control</w:t>
       </w:r>
-      <w:bookmarkEnd w:id="2"/>
     </w:p>
     <w:tbl>
       <w:tblPr>
@@ -275,7 +284,11 @@
           <w:tab w:val="right" w:leader="dot" w:pos="9350"/>
         </w:tabs>
         <w:rPr>
+          <w:rFonts w:eastAsiaTheme="minorEastAsia"/>
           <w:noProof/>
+          <w:kern w:val="2"/>
+          <w:lang w:val="en-AS" w:eastAsia="en-AS"/>
+          <w14:ligatures w14:val="standardContextual"/>
         </w:rPr>
       </w:pPr>
       <w:r>
@@ -287,13 +300,13 @@
       <w:r>
         <w:fldChar w:fldCharType="separate"/>
       </w:r>
-      <w:hyperlink w:anchor="_Toc239955039" w:history="1">
+      <w:hyperlink w:anchor="_Toc239958257" w:history="1">
         <w:r>
           <w:rPr>
             <w:rStyle w:val="Hyperlink"/>
             <w:noProof/>
           </w:rPr>
-          <w:t>Document Control</w:t>
+          <w:t>1. Introduction</w:t>
         </w:r>
         <w:r>
           <w:rPr>
@@ -314,7 +327,7 @@
             <w:noProof/>
             <w:webHidden/>
           </w:rPr>
-          <w:instrText xml:space="preserve"> PAGEREF _Toc239955039 \h </w:instrText>
+          <w:instrText xml:space="preserve"> PAGEREF _Toc239958257 \h </w:instrText>
         </w:r>
         <w:r>
           <w:rPr>
@@ -334,7 +347,7 @@
             <w:noProof/>
             <w:webHidden/>
           </w:rPr>
-          <w:t>1</w:t>
+          <w:t>3</w:t>
         </w:r>
         <w:r>
           <w:rPr>
@@ -352,16 +365,20 @@
           <w:tab w:val="right" w:leader="dot" w:pos="9350"/>
         </w:tabs>
         <w:rPr>
+          <w:rFonts w:eastAsiaTheme="minorEastAsia"/>
           <w:noProof/>
-        </w:rPr>
-      </w:pPr>
-      <w:hyperlink w:anchor="_Toc239955040" w:history="1">
+          <w:kern w:val="2"/>
+          <w:lang w:val="en-AS" w:eastAsia="en-AS"/>
+          <w14:ligatures w14:val="standardContextual"/>
+        </w:rPr>
+      </w:pPr>
+      <w:hyperlink w:anchor="_Toc239958258" w:history="1">
         <w:r>
           <w:rPr>
             <w:rStyle w:val="Hyperlink"/>
             <w:noProof/>
           </w:rPr>
-          <w:t>1. Introduction</w:t>
+          <w:t>2. Existing Software Landscape (Research)</w:t>
         </w:r>
         <w:r>
           <w:rPr>
@@ -382,7 +399,7 @@
             <w:noProof/>
             <w:webHidden/>
           </w:rPr>
-          <w:instrText xml:space="preserve"> PAGEREF _Toc239955040 \h </w:instrText>
+          <w:instrText xml:space="preserve"> PAGEREF _Toc239958258 \h </w:instrText>
         </w:r>
         <w:r>
           <w:rPr>
@@ -403,6 +420,366 @@
             <w:webHidden/>
           </w:rPr>
           <w:t>3</w:t>
+        </w:r>
+        <w:r>
+          <w:rPr>
+            <w:noProof/>
+            <w:webHidden/>
+          </w:rPr>
+          <w:fldChar w:fldCharType="end"/>
+        </w:r>
+      </w:hyperlink>
+    </w:p>
+    <w:p>
+      <w:pPr>
+        <w:pStyle w:val="TOC3"/>
+        <w:tabs>
+          <w:tab w:val="right" w:leader="dot" w:pos="9350"/>
+        </w:tabs>
+        <w:rPr>
+          <w:rFonts w:eastAsiaTheme="minorEastAsia"/>
+          <w:noProof/>
+          <w:kern w:val="2"/>
+          <w:lang w:val="en-AS" w:eastAsia="en-AS"/>
+          <w14:ligatures w14:val="standardContextual"/>
+        </w:rPr>
+      </w:pPr>
+      <w:hyperlink w:anchor="_Toc239958259" w:history="1">
+        <w:r>
+          <w:rPr>
+            <w:rStyle w:val="Hyperlink"/>
+            <w:noProof/>
+          </w:rPr>
+          <w:t>2.1 Purpose of the Research</w:t>
+        </w:r>
+        <w:r>
+          <w:rPr>
+            <w:noProof/>
+            <w:webHidden/>
+          </w:rPr>
+          <w:tab/>
+        </w:r>
+        <w:r>
+          <w:rPr>
+            <w:noProof/>
+            <w:webHidden/>
+          </w:rPr>
+          <w:fldChar w:fldCharType="begin"/>
+        </w:r>
+        <w:r>
+          <w:rPr>
+            <w:noProof/>
+            <w:webHidden/>
+          </w:rPr>
+          <w:instrText xml:space="preserve"> PAGEREF _Toc239958259 \h </w:instrText>
+        </w:r>
+        <w:r>
+          <w:rPr>
+            <w:noProof/>
+            <w:webHidden/>
+          </w:rPr>
+        </w:r>
+        <w:r>
+          <w:rPr>
+            <w:noProof/>
+            <w:webHidden/>
+          </w:rPr>
+          <w:fldChar w:fldCharType="separate"/>
+        </w:r>
+        <w:r>
+          <w:rPr>
+            <w:noProof/>
+            <w:webHidden/>
+          </w:rPr>
+          <w:t>3</w:t>
+        </w:r>
+        <w:r>
+          <w:rPr>
+            <w:noProof/>
+            <w:webHidden/>
+          </w:rPr>
+          <w:fldChar w:fldCharType="end"/>
+        </w:r>
+      </w:hyperlink>
+    </w:p>
+    <w:p>
+      <w:pPr>
+        <w:pStyle w:val="TOC3"/>
+        <w:tabs>
+          <w:tab w:val="right" w:leader="dot" w:pos="9350"/>
+        </w:tabs>
+        <w:rPr>
+          <w:rFonts w:eastAsiaTheme="minorEastAsia"/>
+          <w:noProof/>
+          <w:kern w:val="2"/>
+          <w:lang w:val="en-AS" w:eastAsia="en-AS"/>
+          <w14:ligatures w14:val="standardContextual"/>
+        </w:rPr>
+      </w:pPr>
+      <w:hyperlink w:anchor="_Toc239958260" w:history="1">
+        <w:r>
+          <w:rPr>
+            <w:rStyle w:val="Hyperlink"/>
+            <w:noProof/>
+          </w:rPr>
+          <w:t>2.2 Market Overview</w:t>
+        </w:r>
+        <w:r>
+          <w:rPr>
+            <w:noProof/>
+            <w:webHidden/>
+          </w:rPr>
+          <w:tab/>
+        </w:r>
+        <w:r>
+          <w:rPr>
+            <w:noProof/>
+            <w:webHidden/>
+          </w:rPr>
+          <w:fldChar w:fldCharType="begin"/>
+        </w:r>
+        <w:r>
+          <w:rPr>
+            <w:noProof/>
+            <w:webHidden/>
+          </w:rPr>
+          <w:instrText xml:space="preserve"> PAGEREF _Toc239958260 \h </w:instrText>
+        </w:r>
+        <w:r>
+          <w:rPr>
+            <w:noProof/>
+            <w:webHidden/>
+          </w:rPr>
+        </w:r>
+        <w:r>
+          <w:rPr>
+            <w:noProof/>
+            <w:webHidden/>
+          </w:rPr>
+          <w:fldChar w:fldCharType="separate"/>
+        </w:r>
+        <w:r>
+          <w:rPr>
+            <w:noProof/>
+            <w:webHidden/>
+          </w:rPr>
+          <w:t>3</w:t>
+        </w:r>
+        <w:r>
+          <w:rPr>
+            <w:noProof/>
+            <w:webHidden/>
+          </w:rPr>
+          <w:fldChar w:fldCharType="end"/>
+        </w:r>
+      </w:hyperlink>
+    </w:p>
+    <w:p>
+      <w:pPr>
+        <w:pStyle w:val="TOC3"/>
+        <w:tabs>
+          <w:tab w:val="right" w:leader="dot" w:pos="9350"/>
+        </w:tabs>
+        <w:rPr>
+          <w:rFonts w:eastAsiaTheme="minorEastAsia"/>
+          <w:noProof/>
+          <w:kern w:val="2"/>
+          <w:lang w:val="en-AS" w:eastAsia="en-AS"/>
+          <w14:ligatures w14:val="standardContextual"/>
+        </w:rPr>
+      </w:pPr>
+      <w:hyperlink w:anchor="_Toc239958261" w:history="1">
+        <w:r>
+          <w:rPr>
+            <w:rStyle w:val="Hyperlink"/>
+            <w:noProof/>
+          </w:rPr>
+          <w:t>2.3 Competitor Analysis</w:t>
+        </w:r>
+        <w:r>
+          <w:rPr>
+            <w:noProof/>
+            <w:webHidden/>
+          </w:rPr>
+          <w:tab/>
+        </w:r>
+        <w:r>
+          <w:rPr>
+            <w:noProof/>
+            <w:webHidden/>
+          </w:rPr>
+          <w:fldChar w:fldCharType="begin"/>
+        </w:r>
+        <w:r>
+          <w:rPr>
+            <w:noProof/>
+            <w:webHidden/>
+          </w:rPr>
+          <w:instrText xml:space="preserve"> PAGEREF _Toc239958261 \h </w:instrText>
+        </w:r>
+        <w:r>
+          <w:rPr>
+            <w:noProof/>
+            <w:webHidden/>
+          </w:rPr>
+        </w:r>
+        <w:r>
+          <w:rPr>
+            <w:noProof/>
+            <w:webHidden/>
+          </w:rPr>
+          <w:fldChar w:fldCharType="separate"/>
+        </w:r>
+        <w:r>
+          <w:rPr>
+            <w:noProof/>
+            <w:webHidden/>
+          </w:rPr>
+          <w:t>3</w:t>
+        </w:r>
+        <w:r>
+          <w:rPr>
+            <w:noProof/>
+            <w:webHidden/>
+          </w:rPr>
+          <w:fldChar w:fldCharType="end"/>
+        </w:r>
+      </w:hyperlink>
+    </w:p>
+    <w:p>
+      <w:pPr>
+        <w:pStyle w:val="TOC3"/>
+        <w:tabs>
+          <w:tab w:val="right" w:leader="dot" w:pos="9350"/>
+        </w:tabs>
+        <w:rPr>
+          <w:rFonts w:eastAsiaTheme="minorEastAsia"/>
+          <w:noProof/>
+          <w:kern w:val="2"/>
+          <w:lang w:val="en-AS" w:eastAsia="en-AS"/>
+          <w14:ligatures w14:val="standardContextual"/>
+        </w:rPr>
+      </w:pPr>
+      <w:hyperlink w:anchor="_Toc239958262" w:history="1">
+        <w:r>
+          <w:rPr>
+            <w:rStyle w:val="Hyperlink"/>
+            <w:noProof/>
+          </w:rPr>
+          <w:t>2.4 Common Weaknesses in Current Solutions</w:t>
+        </w:r>
+        <w:r>
+          <w:rPr>
+            <w:noProof/>
+            <w:webHidden/>
+          </w:rPr>
+          <w:tab/>
+        </w:r>
+        <w:r>
+          <w:rPr>
+            <w:noProof/>
+            <w:webHidden/>
+          </w:rPr>
+          <w:fldChar w:fldCharType="begin"/>
+        </w:r>
+        <w:r>
+          <w:rPr>
+            <w:noProof/>
+            <w:webHidden/>
+          </w:rPr>
+          <w:instrText xml:space="preserve"> PAGEREF _Toc239958262 \h </w:instrText>
+        </w:r>
+        <w:r>
+          <w:rPr>
+            <w:noProof/>
+            <w:webHidden/>
+          </w:rPr>
+        </w:r>
+        <w:r>
+          <w:rPr>
+            <w:noProof/>
+            <w:webHidden/>
+          </w:rPr>
+          <w:fldChar w:fldCharType="separate"/>
+        </w:r>
+        <w:r>
+          <w:rPr>
+            <w:noProof/>
+            <w:webHidden/>
+          </w:rPr>
+          <w:t>4</w:t>
+        </w:r>
+        <w:r>
+          <w:rPr>
+            <w:noProof/>
+            <w:webHidden/>
+          </w:rPr>
+          <w:fldChar w:fldCharType="end"/>
+        </w:r>
+      </w:hyperlink>
+    </w:p>
+    <w:p>
+      <w:pPr>
+        <w:pStyle w:val="TOC3"/>
+        <w:tabs>
+          <w:tab w:val="right" w:leader="dot" w:pos="9350"/>
+        </w:tabs>
+        <w:rPr>
+          <w:rFonts w:eastAsiaTheme="minorEastAsia"/>
+          <w:noProof/>
+          <w:kern w:val="2"/>
+          <w:lang w:val="en-AS" w:eastAsia="en-AS"/>
+          <w14:ligatures w14:val="standardContextual"/>
+        </w:rPr>
+      </w:pPr>
+      <w:hyperlink w:anchor="_Toc239958263" w:history="1">
+        <w:r>
+          <w:rPr>
+            <w:rStyle w:val="Hyperlink"/>
+            <w:noProof/>
+          </w:rPr>
+          <w:t>2.5 How Our Platform Will Be Different</w:t>
+        </w:r>
+        <w:r>
+          <w:rPr>
+            <w:noProof/>
+            <w:webHidden/>
+          </w:rPr>
+          <w:tab/>
+        </w:r>
+        <w:r>
+          <w:rPr>
+            <w:noProof/>
+            <w:webHidden/>
+          </w:rPr>
+          <w:fldChar w:fldCharType="begin"/>
+        </w:r>
+        <w:r>
+          <w:rPr>
+            <w:noProof/>
+            <w:webHidden/>
+          </w:rPr>
+          <w:instrText xml:space="preserve"> PAGEREF _Toc239958263 \h </w:instrText>
+        </w:r>
+        <w:r>
+          <w:rPr>
+            <w:noProof/>
+            <w:webHidden/>
+          </w:rPr>
+        </w:r>
+        <w:r>
+          <w:rPr>
+            <w:noProof/>
+            <w:webHidden/>
+          </w:rPr>
+          <w:fldChar w:fldCharType="separate"/>
+        </w:r>
+        <w:r>
+          <w:rPr>
+            <w:noProof/>
+            <w:webHidden/>
+          </w:rPr>
+          <w:t>5</w:t>
         </w:r>
         <w:r>
           <w:rPr>
@@ -420,16 +797,20 @@
           <w:tab w:val="right" w:leader="dot" w:pos="9350"/>
         </w:tabs>
         <w:rPr>
+          <w:rFonts w:eastAsiaTheme="minorEastAsia"/>
           <w:noProof/>
-        </w:rPr>
-      </w:pPr>
-      <w:hyperlink w:anchor="_Toc239955041" w:history="1">
+          <w:kern w:val="2"/>
+          <w:lang w:val="en-AS" w:eastAsia="en-AS"/>
+          <w14:ligatures w14:val="standardContextual"/>
+        </w:rPr>
+      </w:pPr>
+      <w:hyperlink w:anchor="_Toc239958264" w:history="1">
         <w:r>
           <w:rPr>
             <w:rStyle w:val="Hyperlink"/>
             <w:noProof/>
           </w:rPr>
-          <w:t>2. Existing Software Landscape (Research)</w:t>
+          <w:t>3. Vision and Scope</w:t>
         </w:r>
         <w:r>
           <w:rPr>
@@ -450,7 +831,7 @@
             <w:noProof/>
             <w:webHidden/>
           </w:rPr>
-          <w:instrText xml:space="preserve"> PAGEREF _Toc239955041 \h </w:instrText>
+          <w:instrText xml:space="preserve"> PAGEREF _Toc239958264 \h </w:instrText>
         </w:r>
         <w:r>
           <w:rPr>
@@ -470,7 +851,7 @@
             <w:noProof/>
             <w:webHidden/>
           </w:rPr>
-          <w:t>3</w:t>
+          <w:t>5</w:t>
         </w:r>
         <w:r>
           <w:rPr>
@@ -488,16 +869,20 @@
           <w:tab w:val="right" w:leader="dot" w:pos="9350"/>
         </w:tabs>
         <w:rPr>
+          <w:rFonts w:eastAsiaTheme="minorEastAsia"/>
           <w:noProof/>
-        </w:rPr>
-      </w:pPr>
-      <w:hyperlink w:anchor="_Toc239955042" w:history="1">
+          <w:kern w:val="2"/>
+          <w:lang w:val="en-AS" w:eastAsia="en-AS"/>
+          <w14:ligatures w14:val="standardContextual"/>
+        </w:rPr>
+      </w:pPr>
+      <w:hyperlink w:anchor="_Toc239958265" w:history="1">
         <w:r>
           <w:rPr>
             <w:rStyle w:val="Hyperlink"/>
             <w:noProof/>
           </w:rPr>
-          <w:t>2.1 Purpose of the Research</w:t>
+          <w:t>3.1 About $oftware ¢orp.</w:t>
         </w:r>
         <w:r>
           <w:rPr>
@@ -518,7 +903,7 @@
             <w:noProof/>
             <w:webHidden/>
           </w:rPr>
-          <w:instrText xml:space="preserve"> PAGEREF _Toc239955042 \h </w:instrText>
+          <w:instrText xml:space="preserve"> PAGEREF _Toc239958265 \h </w:instrText>
         </w:r>
         <w:r>
           <w:rPr>
@@ -538,7 +923,7 @@
             <w:noProof/>
             <w:webHidden/>
           </w:rPr>
-          <w:t>3</w:t>
+          <w:t>5</w:t>
         </w:r>
         <w:r>
           <w:rPr>
@@ -556,16 +941,20 @@
           <w:tab w:val="right" w:leader="dot" w:pos="9350"/>
         </w:tabs>
         <w:rPr>
+          <w:rFonts w:eastAsiaTheme="minorEastAsia"/>
           <w:noProof/>
-        </w:rPr>
-      </w:pPr>
-      <w:hyperlink w:anchor="_Toc239955043" w:history="1">
+          <w:kern w:val="2"/>
+          <w:lang w:val="en-AS" w:eastAsia="en-AS"/>
+          <w14:ligatures w14:val="standardContextual"/>
+        </w:rPr>
+      </w:pPr>
+      <w:hyperlink w:anchor="_Toc239958266" w:history="1">
         <w:r>
           <w:rPr>
             <w:rStyle w:val="Hyperlink"/>
             <w:noProof/>
           </w:rPr>
-          <w:t>2.2 Market Overview</w:t>
+          <w:t>3.2 How This Project Was Acquired</w:t>
         </w:r>
         <w:r>
           <w:rPr>
@@ -586,7 +975,7 @@
             <w:noProof/>
             <w:webHidden/>
           </w:rPr>
-          <w:instrText xml:space="preserve"> PAGEREF _Toc239955043 \h </w:instrText>
+          <w:instrText xml:space="preserve"> PAGEREF _Toc239958266 \h </w:instrText>
         </w:r>
         <w:r>
           <w:rPr>
@@ -606,7 +995,7 @@
             <w:noProof/>
             <w:webHidden/>
           </w:rPr>
-          <w:t>3</w:t>
+          <w:t>6</w:t>
         </w:r>
         <w:r>
           <w:rPr>
@@ -624,16 +1013,20 @@
           <w:tab w:val="right" w:leader="dot" w:pos="9350"/>
         </w:tabs>
         <w:rPr>
+          <w:rFonts w:eastAsiaTheme="minorEastAsia"/>
           <w:noProof/>
-        </w:rPr>
-      </w:pPr>
-      <w:hyperlink w:anchor="_Toc239955044" w:history="1">
+          <w:kern w:val="2"/>
+          <w:lang w:val="en-AS" w:eastAsia="en-AS"/>
+          <w14:ligatures w14:val="standardContextual"/>
+        </w:rPr>
+      </w:pPr>
+      <w:hyperlink w:anchor="_Toc239958267" w:history="1">
         <w:r>
           <w:rPr>
             <w:rStyle w:val="Hyperlink"/>
             <w:noProof/>
           </w:rPr>
-          <w:t>2.3 Competitor Analysis</w:t>
+          <w:t>3.3 Business Need</w:t>
         </w:r>
         <w:r>
           <w:rPr>
@@ -654,7 +1047,7 @@
             <w:noProof/>
             <w:webHidden/>
           </w:rPr>
-          <w:instrText xml:space="preserve"> PAGEREF _Toc239955044 \h </w:instrText>
+          <w:instrText xml:space="preserve"> PAGEREF _Toc239958267 \h </w:instrText>
         </w:r>
         <w:r>
           <w:rPr>
@@ -674,7 +1067,7 @@
             <w:noProof/>
             <w:webHidden/>
           </w:rPr>
-          <w:t>3</w:t>
+          <w:t>6</w:t>
         </w:r>
         <w:r>
           <w:rPr>
@@ -692,16 +1085,20 @@
           <w:tab w:val="right" w:leader="dot" w:pos="9350"/>
         </w:tabs>
         <w:rPr>
+          <w:rFonts w:eastAsiaTheme="minorEastAsia"/>
           <w:noProof/>
-        </w:rPr>
-      </w:pPr>
-      <w:hyperlink w:anchor="_Toc239955045" w:history="1">
+          <w:kern w:val="2"/>
+          <w:lang w:val="en-AS" w:eastAsia="en-AS"/>
+          <w14:ligatures w14:val="standardContextual"/>
+        </w:rPr>
+      </w:pPr>
+      <w:hyperlink w:anchor="_Toc239958268" w:history="1">
         <w:r>
           <w:rPr>
             <w:rStyle w:val="Hyperlink"/>
             <w:noProof/>
           </w:rPr>
-          <w:t>2.4 Common Weaknesses in Current Solutions</w:t>
+          <w:t>3.4 Vision Statement</w:t>
         </w:r>
         <w:r>
           <w:rPr>
@@ -722,7 +1119,7 @@
             <w:noProof/>
             <w:webHidden/>
           </w:rPr>
-          <w:instrText xml:space="preserve"> PAGEREF _Toc239955045 \h </w:instrText>
+          <w:instrText xml:space="preserve"> PAGEREF _Toc239958268 \h </w:instrText>
         </w:r>
         <w:r>
           <w:rPr>
@@ -742,7 +1139,7 @@
             <w:noProof/>
             <w:webHidden/>
           </w:rPr>
-          <w:t>4</w:t>
+          <w:t>6</w:t>
         </w:r>
         <w:r>
           <w:rPr>
@@ -760,16 +1157,20 @@
           <w:tab w:val="right" w:leader="dot" w:pos="9350"/>
         </w:tabs>
         <w:rPr>
+          <w:rFonts w:eastAsiaTheme="minorEastAsia"/>
           <w:noProof/>
-        </w:rPr>
-      </w:pPr>
-      <w:hyperlink w:anchor="_Toc239955046" w:history="1">
+          <w:kern w:val="2"/>
+          <w:lang w:val="en-AS" w:eastAsia="en-AS"/>
+          <w14:ligatures w14:val="standardContextual"/>
+        </w:rPr>
+      </w:pPr>
+      <w:hyperlink w:anchor="_Toc239958269" w:history="1">
         <w:r>
           <w:rPr>
             <w:rStyle w:val="Hyperlink"/>
             <w:noProof/>
           </w:rPr>
-          <w:t>2.5 How Our Platform Will Be Different</w:t>
+          <w:t>3.5 Business Objectives and Success Metrics</w:t>
         </w:r>
         <w:r>
           <w:rPr>
@@ -790,7 +1191,7 @@
             <w:noProof/>
             <w:webHidden/>
           </w:rPr>
-          <w:instrText xml:space="preserve"> PAGEREF _Toc239955046 \h </w:instrText>
+          <w:instrText xml:space="preserve"> PAGEREF _Toc239958269 \h </w:instrText>
         </w:r>
         <w:r>
           <w:rPr>
@@ -810,7 +1211,295 @@
             <w:noProof/>
             <w:webHidden/>
           </w:rPr>
-          <w:t>5</w:t>
+          <w:t>6</w:t>
+        </w:r>
+        <w:r>
+          <w:rPr>
+            <w:noProof/>
+            <w:webHidden/>
+          </w:rPr>
+          <w:fldChar w:fldCharType="end"/>
+        </w:r>
+      </w:hyperlink>
+    </w:p>
+    <w:p>
+      <w:pPr>
+        <w:pStyle w:val="TOC3"/>
+        <w:tabs>
+          <w:tab w:val="right" w:leader="dot" w:pos="9350"/>
+        </w:tabs>
+        <w:rPr>
+          <w:rFonts w:eastAsiaTheme="minorEastAsia"/>
+          <w:noProof/>
+          <w:kern w:val="2"/>
+          <w:lang w:val="en-AS" w:eastAsia="en-AS"/>
+          <w14:ligatures w14:val="standardContextual"/>
+        </w:rPr>
+      </w:pPr>
+      <w:hyperlink w:anchor="_Toc239958270" w:history="1">
+        <w:r>
+          <w:rPr>
+            <w:rStyle w:val="Hyperlink"/>
+            <w:noProof/>
+          </w:rPr>
+          <w:t>3.6 Project Overview</w:t>
+        </w:r>
+        <w:r>
+          <w:rPr>
+            <w:noProof/>
+            <w:webHidden/>
+          </w:rPr>
+          <w:tab/>
+        </w:r>
+        <w:r>
+          <w:rPr>
+            <w:noProof/>
+            <w:webHidden/>
+          </w:rPr>
+          <w:fldChar w:fldCharType="begin"/>
+        </w:r>
+        <w:r>
+          <w:rPr>
+            <w:noProof/>
+            <w:webHidden/>
+          </w:rPr>
+          <w:instrText xml:space="preserve"> PAGEREF _Toc239958270 \h </w:instrText>
+        </w:r>
+        <w:r>
+          <w:rPr>
+            <w:noProof/>
+            <w:webHidden/>
+          </w:rPr>
+        </w:r>
+        <w:r>
+          <w:rPr>
+            <w:noProof/>
+            <w:webHidden/>
+          </w:rPr>
+          <w:fldChar w:fldCharType="separate"/>
+        </w:r>
+        <w:r>
+          <w:rPr>
+            <w:noProof/>
+            <w:webHidden/>
+          </w:rPr>
+          <w:t>7</w:t>
+        </w:r>
+        <w:r>
+          <w:rPr>
+            <w:noProof/>
+            <w:webHidden/>
+          </w:rPr>
+          <w:fldChar w:fldCharType="end"/>
+        </w:r>
+      </w:hyperlink>
+    </w:p>
+    <w:p>
+      <w:pPr>
+        <w:pStyle w:val="TOC3"/>
+        <w:tabs>
+          <w:tab w:val="right" w:leader="dot" w:pos="9350"/>
+        </w:tabs>
+        <w:rPr>
+          <w:rFonts w:eastAsiaTheme="minorEastAsia"/>
+          <w:noProof/>
+          <w:kern w:val="2"/>
+          <w:lang w:val="en-AS" w:eastAsia="en-AS"/>
+          <w14:ligatures w14:val="standardContextual"/>
+        </w:rPr>
+      </w:pPr>
+      <w:hyperlink w:anchor="_Toc239958271" w:history="1">
+        <w:r>
+          <w:rPr>
+            <w:rStyle w:val="Hyperlink"/>
+            <w:noProof/>
+          </w:rPr>
+          <w:t>3.7 Scope — In and Out</w:t>
+        </w:r>
+        <w:r>
+          <w:rPr>
+            <w:noProof/>
+            <w:webHidden/>
+          </w:rPr>
+          <w:tab/>
+        </w:r>
+        <w:r>
+          <w:rPr>
+            <w:noProof/>
+            <w:webHidden/>
+          </w:rPr>
+          <w:fldChar w:fldCharType="begin"/>
+        </w:r>
+        <w:r>
+          <w:rPr>
+            <w:noProof/>
+            <w:webHidden/>
+          </w:rPr>
+          <w:instrText xml:space="preserve"> PAGEREF _Toc239958271 \h </w:instrText>
+        </w:r>
+        <w:r>
+          <w:rPr>
+            <w:noProof/>
+            <w:webHidden/>
+          </w:rPr>
+        </w:r>
+        <w:r>
+          <w:rPr>
+            <w:noProof/>
+            <w:webHidden/>
+          </w:rPr>
+          <w:fldChar w:fldCharType="separate"/>
+        </w:r>
+        <w:r>
+          <w:rPr>
+            <w:noProof/>
+            <w:webHidden/>
+          </w:rPr>
+          <w:t>7</w:t>
+        </w:r>
+        <w:r>
+          <w:rPr>
+            <w:noProof/>
+            <w:webHidden/>
+          </w:rPr>
+          <w:fldChar w:fldCharType="end"/>
+        </w:r>
+      </w:hyperlink>
+    </w:p>
+    <w:p>
+      <w:pPr>
+        <w:pStyle w:val="TOC3"/>
+        <w:tabs>
+          <w:tab w:val="right" w:leader="dot" w:pos="9350"/>
+        </w:tabs>
+        <w:rPr>
+          <w:rFonts w:eastAsiaTheme="minorEastAsia"/>
+          <w:noProof/>
+          <w:kern w:val="2"/>
+          <w:lang w:val="en-AS" w:eastAsia="en-AS"/>
+          <w14:ligatures w14:val="standardContextual"/>
+        </w:rPr>
+      </w:pPr>
+      <w:hyperlink w:anchor="_Toc239958272" w:history="1">
+        <w:r>
+          <w:rPr>
+            <w:rStyle w:val="Hyperlink"/>
+            <w:noProof/>
+          </w:rPr>
+          <w:t>3.8 Stakeholders</w:t>
+        </w:r>
+        <w:r>
+          <w:rPr>
+            <w:noProof/>
+            <w:webHidden/>
+          </w:rPr>
+          <w:tab/>
+        </w:r>
+        <w:r>
+          <w:rPr>
+            <w:noProof/>
+            <w:webHidden/>
+          </w:rPr>
+          <w:fldChar w:fldCharType="begin"/>
+        </w:r>
+        <w:r>
+          <w:rPr>
+            <w:noProof/>
+            <w:webHidden/>
+          </w:rPr>
+          <w:instrText xml:space="preserve"> PAGEREF _Toc239958272 \h </w:instrText>
+        </w:r>
+        <w:r>
+          <w:rPr>
+            <w:noProof/>
+            <w:webHidden/>
+          </w:rPr>
+        </w:r>
+        <w:r>
+          <w:rPr>
+            <w:noProof/>
+            <w:webHidden/>
+          </w:rPr>
+          <w:fldChar w:fldCharType="separate"/>
+        </w:r>
+        <w:r>
+          <w:rPr>
+            <w:noProof/>
+            <w:webHidden/>
+          </w:rPr>
+          <w:t>8</w:t>
+        </w:r>
+        <w:r>
+          <w:rPr>
+            <w:noProof/>
+            <w:webHidden/>
+          </w:rPr>
+          <w:fldChar w:fldCharType="end"/>
+        </w:r>
+      </w:hyperlink>
+    </w:p>
+    <w:p>
+      <w:pPr>
+        <w:pStyle w:val="TOC3"/>
+        <w:tabs>
+          <w:tab w:val="right" w:leader="dot" w:pos="9350"/>
+        </w:tabs>
+        <w:rPr>
+          <w:rFonts w:eastAsiaTheme="minorEastAsia"/>
+          <w:noProof/>
+          <w:kern w:val="2"/>
+          <w:lang w:val="en-AS" w:eastAsia="en-AS"/>
+          <w14:ligatures w14:val="standardContextual"/>
+        </w:rPr>
+      </w:pPr>
+      <w:hyperlink w:anchor="_Toc239958273" w:history="1">
+        <w:r>
+          <w:rPr>
+            <w:rStyle w:val="Hyperlink"/>
+            <w:noProof/>
+          </w:rPr>
+          <w:t>3.9 Constraints and Assumptions</w:t>
+        </w:r>
+        <w:r>
+          <w:rPr>
+            <w:noProof/>
+            <w:webHidden/>
+          </w:rPr>
+          <w:tab/>
+        </w:r>
+        <w:r>
+          <w:rPr>
+            <w:noProof/>
+            <w:webHidden/>
+          </w:rPr>
+          <w:fldChar w:fldCharType="begin"/>
+        </w:r>
+        <w:r>
+          <w:rPr>
+            <w:noProof/>
+            <w:webHidden/>
+          </w:rPr>
+          <w:instrText xml:space="preserve"> PAGEREF _Toc239958273 \h </w:instrText>
+        </w:r>
+        <w:r>
+          <w:rPr>
+            <w:noProof/>
+            <w:webHidden/>
+          </w:rPr>
+        </w:r>
+        <w:r>
+          <w:rPr>
+            <w:noProof/>
+            <w:webHidden/>
+          </w:rPr>
+          <w:fldChar w:fldCharType="separate"/>
+        </w:r>
+        <w:r>
+          <w:rPr>
+            <w:noProof/>
+            <w:webHidden/>
+          </w:rPr>
+          <w:t>8</w:t>
         </w:r>
         <w:r>
           <w:rPr>
@@ -828,16 +1517,20 @@
           <w:tab w:val="right" w:leader="dot" w:pos="9350"/>
         </w:tabs>
         <w:rPr>
+          <w:rFonts w:eastAsiaTheme="minorEastAsia"/>
           <w:noProof/>
-        </w:rPr>
-      </w:pPr>
-      <w:hyperlink w:anchor="_Toc239955047" w:history="1">
+          <w:kern w:val="2"/>
+          <w:lang w:val="en-AS" w:eastAsia="en-AS"/>
+          <w14:ligatures w14:val="standardContextual"/>
+        </w:rPr>
+      </w:pPr>
+      <w:hyperlink w:anchor="_Toc239958274" w:history="1">
         <w:r>
           <w:rPr>
             <w:rStyle w:val="Hyperlink"/>
             <w:noProof/>
           </w:rPr>
-          <w:t>3. Vision and Scope</w:t>
+          <w:t>4. Software Requirements Specification (Draft)</w:t>
         </w:r>
         <w:r>
           <w:rPr>
@@ -858,7 +1551,7 @@
             <w:noProof/>
             <w:webHidden/>
           </w:rPr>
-          <w:instrText xml:space="preserve"> PAGEREF _Toc239955047 \h </w:instrText>
+          <w:instrText xml:space="preserve"> PAGEREF _Toc239958274 \h </w:instrText>
         </w:r>
         <w:r>
           <w:rPr>
@@ -878,7 +1571,7 @@
             <w:noProof/>
             <w:webHidden/>
           </w:rPr>
-          <w:t>5</w:t>
+          <w:t>9</w:t>
         </w:r>
         <w:r>
           <w:rPr>
@@ -896,16 +1589,20 @@
           <w:tab w:val="right" w:leader="dot" w:pos="9350"/>
         </w:tabs>
         <w:rPr>
+          <w:rFonts w:eastAsiaTheme="minorEastAsia"/>
           <w:noProof/>
-        </w:rPr>
-      </w:pPr>
-      <w:hyperlink w:anchor="_Toc239955048" w:history="1">
+          <w:kern w:val="2"/>
+          <w:lang w:val="en-AS" w:eastAsia="en-AS"/>
+          <w14:ligatures w14:val="standardContextual"/>
+        </w:rPr>
+      </w:pPr>
+      <w:hyperlink w:anchor="_Toc239958275" w:history="1">
         <w:r>
           <w:rPr>
             <w:rStyle w:val="Hyperlink"/>
             <w:noProof/>
           </w:rPr>
-          <w:t>3.1 About $oftware ¢orp.</w:t>
+          <w:t>4.1 Purpose and Scope of the SRS</w:t>
         </w:r>
         <w:r>
           <w:rPr>
@@ -926,7 +1623,7 @@
             <w:noProof/>
             <w:webHidden/>
           </w:rPr>
-          <w:instrText xml:space="preserve"> PAGEREF _Toc239955048 \h </w:instrText>
+          <w:instrText xml:space="preserve"> PAGEREF _Toc239958275 \h </w:instrText>
         </w:r>
         <w:r>
           <w:rPr>
@@ -946,7 +1643,7 @@
             <w:noProof/>
             <w:webHidden/>
           </w:rPr>
-          <w:t>5</w:t>
+          <w:t>9</w:t>
         </w:r>
         <w:r>
           <w:rPr>
@@ -964,16 +1661,20 @@
           <w:tab w:val="right" w:leader="dot" w:pos="9350"/>
         </w:tabs>
         <w:rPr>
+          <w:rFonts w:eastAsiaTheme="minorEastAsia"/>
           <w:noProof/>
-        </w:rPr>
-      </w:pPr>
-      <w:hyperlink w:anchor="_Toc239955049" w:history="1">
+          <w:kern w:val="2"/>
+          <w:lang w:val="en-AS" w:eastAsia="en-AS"/>
+          <w14:ligatures w14:val="standardContextual"/>
+        </w:rPr>
+      </w:pPr>
+      <w:hyperlink w:anchor="_Toc239958276" w:history="1">
         <w:r>
           <w:rPr>
             <w:rStyle w:val="Hyperlink"/>
             <w:noProof/>
           </w:rPr>
-          <w:t>3.2 How This Project Was Acquired</w:t>
+          <w:t>4.2 Definitions and Acronyms</w:t>
         </w:r>
         <w:r>
           <w:rPr>
@@ -994,7 +1695,7 @@
             <w:noProof/>
             <w:webHidden/>
           </w:rPr>
-          <w:instrText xml:space="preserve"> PAGEREF _Toc239955049 \h </w:instrText>
+          <w:instrText xml:space="preserve"> PAGEREF _Toc239958276 \h </w:instrText>
         </w:r>
         <w:r>
           <w:rPr>
@@ -1014,7 +1715,7 @@
             <w:noProof/>
             <w:webHidden/>
           </w:rPr>
-          <w:t>6</w:t>
+          <w:t>9</w:t>
         </w:r>
         <w:r>
           <w:rPr>
@@ -1032,16 +1733,20 @@
           <w:tab w:val="right" w:leader="dot" w:pos="9350"/>
         </w:tabs>
         <w:rPr>
+          <w:rFonts w:eastAsiaTheme="minorEastAsia"/>
           <w:noProof/>
-        </w:rPr>
-      </w:pPr>
-      <w:hyperlink w:anchor="_Toc239955050" w:history="1">
+          <w:kern w:val="2"/>
+          <w:lang w:val="en-AS" w:eastAsia="en-AS"/>
+          <w14:ligatures w14:val="standardContextual"/>
+        </w:rPr>
+      </w:pPr>
+      <w:hyperlink w:anchor="_Toc239958277" w:history="1">
         <w:r>
           <w:rPr>
             <w:rStyle w:val="Hyperlink"/>
             <w:noProof/>
           </w:rPr>
-          <w:t>3.3 Business Need</w:t>
+          <w:t>4.3 Actors</w:t>
         </w:r>
         <w:r>
           <w:rPr>
@@ -1062,7 +1767,7 @@
             <w:noProof/>
             <w:webHidden/>
           </w:rPr>
-          <w:instrText xml:space="preserve"> PAGEREF _Toc239955050 \h </w:instrText>
+          <w:instrText xml:space="preserve"> PAGEREF _Toc239958277 \h </w:instrText>
         </w:r>
         <w:r>
           <w:rPr>
@@ -1082,7 +1787,7 @@
             <w:noProof/>
             <w:webHidden/>
           </w:rPr>
-          <w:t>6</w:t>
+          <w:t>9</w:t>
         </w:r>
         <w:r>
           <w:rPr>
@@ -1100,16 +1805,20 @@
           <w:tab w:val="right" w:leader="dot" w:pos="9350"/>
         </w:tabs>
         <w:rPr>
+          <w:rFonts w:eastAsiaTheme="minorEastAsia"/>
           <w:noProof/>
-        </w:rPr>
-      </w:pPr>
-      <w:hyperlink w:anchor="_Toc239955051" w:history="1">
+          <w:kern w:val="2"/>
+          <w:lang w:val="en-AS" w:eastAsia="en-AS"/>
+          <w14:ligatures w14:val="standardContextual"/>
+        </w:rPr>
+      </w:pPr>
+      <w:hyperlink w:anchor="_Toc239958278" w:history="1">
         <w:r>
           <w:rPr>
             <w:rStyle w:val="Hyperlink"/>
             <w:noProof/>
           </w:rPr>
-          <w:t>3.4 Vision Statement</w:t>
+          <w:t>4.4 Use Cases</w:t>
         </w:r>
         <w:r>
           <w:rPr>
@@ -1130,7 +1839,7 @@
             <w:noProof/>
             <w:webHidden/>
           </w:rPr>
-          <w:instrText xml:space="preserve"> PAGEREF _Toc239955051 \h </w:instrText>
+          <w:instrText xml:space="preserve"> PAGEREF _Toc239958278 \h </w:instrText>
         </w:r>
         <w:r>
           <w:rPr>
@@ -1150,7 +1859,7 @@
             <w:noProof/>
             <w:webHidden/>
           </w:rPr>
-          <w:t>6</w:t>
+          <w:t>9</w:t>
         </w:r>
         <w:r>
           <w:rPr>
@@ -1168,16 +1877,20 @@
           <w:tab w:val="right" w:leader="dot" w:pos="9350"/>
         </w:tabs>
         <w:rPr>
+          <w:rFonts w:eastAsiaTheme="minorEastAsia"/>
           <w:noProof/>
-        </w:rPr>
-      </w:pPr>
-      <w:hyperlink w:anchor="_Toc239955052" w:history="1">
+          <w:kern w:val="2"/>
+          <w:lang w:val="en-AS" w:eastAsia="en-AS"/>
+          <w14:ligatures w14:val="standardContextual"/>
+        </w:rPr>
+      </w:pPr>
+      <w:hyperlink w:anchor="_Toc239958279" w:history="1">
         <w:r>
           <w:rPr>
             <w:rStyle w:val="Hyperlink"/>
             <w:noProof/>
           </w:rPr>
-          <w:t>3.5 Business Objectives and Success Metrics</w:t>
+          <w:t>4.5 Non-Functional Requirements</w:t>
         </w:r>
         <w:r>
           <w:rPr>
@@ -1198,7 +1911,7 @@
             <w:noProof/>
             <w:webHidden/>
           </w:rPr>
-          <w:instrText xml:space="preserve"> PAGEREF _Toc239955052 \h </w:instrText>
+          <w:instrText xml:space="preserve"> PAGEREF _Toc239958279 \h </w:instrText>
         </w:r>
         <w:r>
           <w:rPr>
@@ -1218,7 +1931,7 @@
             <w:noProof/>
             <w:webHidden/>
           </w:rPr>
-          <w:t>6</w:t>
+          <w:t>13</w:t>
         </w:r>
         <w:r>
           <w:rPr>
@@ -1236,16 +1949,20 @@
           <w:tab w:val="right" w:leader="dot" w:pos="9350"/>
         </w:tabs>
         <w:rPr>
+          <w:rFonts w:eastAsiaTheme="minorEastAsia"/>
           <w:noProof/>
-        </w:rPr>
-      </w:pPr>
-      <w:hyperlink w:anchor="_Toc239955053" w:history="1">
+          <w:kern w:val="2"/>
+          <w:lang w:val="en-AS" w:eastAsia="en-AS"/>
+          <w14:ligatures w14:val="standardContextual"/>
+        </w:rPr>
+      </w:pPr>
+      <w:hyperlink w:anchor="_Toc239958280" w:history="1">
         <w:r>
           <w:rPr>
             <w:rStyle w:val="Hyperlink"/>
             <w:noProof/>
           </w:rPr>
-          <w:t>3.6 Project Overview</w:t>
+          <w:t>4.6 External Interfaces</w:t>
         </w:r>
         <w:r>
           <w:rPr>
@@ -1266,7 +1983,7 @@
             <w:noProof/>
             <w:webHidden/>
           </w:rPr>
-          <w:instrText xml:space="preserve"> PAGEREF _Toc239955053 \h </w:instrText>
+          <w:instrText xml:space="preserve"> PAGEREF _Toc239958280 \h </w:instrText>
         </w:r>
         <w:r>
           <w:rPr>
@@ -1286,7 +2003,7 @@
             <w:noProof/>
             <w:webHidden/>
           </w:rPr>
-          <w:t>7</w:t>
+          <w:t>14</w:t>
         </w:r>
         <w:r>
           <w:rPr>
@@ -1304,16 +2021,20 @@
           <w:tab w:val="right" w:leader="dot" w:pos="9350"/>
         </w:tabs>
         <w:rPr>
+          <w:rFonts w:eastAsiaTheme="minorEastAsia"/>
           <w:noProof/>
-        </w:rPr>
-      </w:pPr>
-      <w:hyperlink w:anchor="_Toc239955054" w:history="1">
+          <w:kern w:val="2"/>
+          <w:lang w:val="en-AS" w:eastAsia="en-AS"/>
+          <w14:ligatures w14:val="standardContextual"/>
+        </w:rPr>
+      </w:pPr>
+      <w:hyperlink w:anchor="_Toc239958281" w:history="1">
         <w:r>
           <w:rPr>
             <w:rStyle w:val="Hyperlink"/>
             <w:noProof/>
           </w:rPr>
-          <w:t>3.7 Scope — In and Out</w:t>
+          <w:t>4.7 Open Items for Future Versions</w:t>
         </w:r>
         <w:r>
           <w:rPr>
@@ -1334,7 +2055,7 @@
             <w:noProof/>
             <w:webHidden/>
           </w:rPr>
-          <w:instrText xml:space="preserve"> PAGEREF _Toc239955054 \h </w:instrText>
+          <w:instrText xml:space="preserve"> PAGEREF _Toc239958281 \h </w:instrText>
         </w:r>
         <w:r>
           <w:rPr>
@@ -1354,143 +2075,7 @@
             <w:noProof/>
             <w:webHidden/>
           </w:rPr>
-          <w:t>7</w:t>
-        </w:r>
-        <w:r>
-          <w:rPr>
-            <w:noProof/>
-            <w:webHidden/>
-          </w:rPr>
-          <w:fldChar w:fldCharType="end"/>
-        </w:r>
-      </w:hyperlink>
-    </w:p>
-    <w:p>
-      <w:pPr>
-        <w:pStyle w:val="TOC3"/>
-        <w:tabs>
-          <w:tab w:val="right" w:leader="dot" w:pos="9350"/>
-        </w:tabs>
-        <w:rPr>
-          <w:noProof/>
-        </w:rPr>
-      </w:pPr>
-      <w:hyperlink w:anchor="_Toc239955055" w:history="1">
-        <w:r>
-          <w:rPr>
-            <w:rStyle w:val="Hyperlink"/>
-            <w:noProof/>
-          </w:rPr>
-          <w:t>3.8 Stakeholders</w:t>
-        </w:r>
-        <w:r>
-          <w:rPr>
-            <w:noProof/>
-            <w:webHidden/>
-          </w:rPr>
-          <w:tab/>
-        </w:r>
-        <w:r>
-          <w:rPr>
-            <w:noProof/>
-            <w:webHidden/>
-          </w:rPr>
-          <w:fldChar w:fldCharType="begin"/>
-        </w:r>
-        <w:r>
-          <w:rPr>
-            <w:noProof/>
-            <w:webHidden/>
-          </w:rPr>
-          <w:instrText xml:space="preserve"> PAGEREF _Toc239955055 \h </w:instrText>
-        </w:r>
-        <w:r>
-          <w:rPr>
-            <w:noProof/>
-            <w:webHidden/>
-          </w:rPr>
-        </w:r>
-        <w:r>
-          <w:rPr>
-            <w:noProof/>
-            <w:webHidden/>
-          </w:rPr>
-          <w:fldChar w:fldCharType="separate"/>
-        </w:r>
-        <w:r>
-          <w:rPr>
-            <w:noProof/>
-            <w:webHidden/>
-          </w:rPr>
-          <w:t>8</w:t>
-        </w:r>
-        <w:r>
-          <w:rPr>
-            <w:noProof/>
-            <w:webHidden/>
-          </w:rPr>
-          <w:fldChar w:fldCharType="end"/>
-        </w:r>
-      </w:hyperlink>
-    </w:p>
-    <w:p>
-      <w:pPr>
-        <w:pStyle w:val="TOC3"/>
-        <w:tabs>
-          <w:tab w:val="right" w:leader="dot" w:pos="9350"/>
-        </w:tabs>
-        <w:rPr>
-          <w:noProof/>
-        </w:rPr>
-      </w:pPr>
-      <w:hyperlink w:anchor="_Toc239955056" w:history="1">
-        <w:r>
-          <w:rPr>
-            <w:rStyle w:val="Hyperlink"/>
-            <w:noProof/>
-          </w:rPr>
-          <w:t>3.9 Constraints and Assumptions</w:t>
-        </w:r>
-        <w:r>
-          <w:rPr>
-            <w:noProof/>
-            <w:webHidden/>
-          </w:rPr>
-          <w:tab/>
-        </w:r>
-        <w:r>
-          <w:rPr>
-            <w:noProof/>
-            <w:webHidden/>
-          </w:rPr>
-          <w:fldChar w:fldCharType="begin"/>
-        </w:r>
-        <w:r>
-          <w:rPr>
-            <w:noProof/>
-            <w:webHidden/>
-          </w:rPr>
-          <w:instrText xml:space="preserve"> PAGEREF _Toc239955056 \h </w:instrText>
-        </w:r>
-        <w:r>
-          <w:rPr>
-            <w:noProof/>
-            <w:webHidden/>
-          </w:rPr>
-        </w:r>
-        <w:r>
-          <w:rPr>
-            <w:noProof/>
-            <w:webHidden/>
-          </w:rPr>
-          <w:fldChar w:fldCharType="separate"/>
-        </w:r>
-        <w:r>
-          <w:rPr>
-            <w:noProof/>
-            <w:webHidden/>
-          </w:rPr>
-          <w:t>8</w:t>
+          <w:t>14</w:t>
         </w:r>
         <w:r>
           <w:rPr>
@@ -1508,16 +2093,20 @@
           <w:tab w:val="right" w:leader="dot" w:pos="9350"/>
         </w:tabs>
         <w:rPr>
+          <w:rFonts w:eastAsiaTheme="minorEastAsia"/>
           <w:noProof/>
-        </w:rPr>
-      </w:pPr>
-      <w:hyperlink w:anchor="_Toc239955057" w:history="1">
+          <w:kern w:val="2"/>
+          <w:lang w:val="en-AS" w:eastAsia="en-AS"/>
+          <w14:ligatures w14:val="standardContextual"/>
+        </w:rPr>
+      </w:pPr>
+      <w:hyperlink w:anchor="_Toc239958282" w:history="1">
         <w:r>
           <w:rPr>
             <w:rStyle w:val="Hyperlink"/>
             <w:noProof/>
           </w:rPr>
-          <w:t>4. Software Requirements Specification (Draft)</w:t>
+          <w:t>5. Next Steps</w:t>
         </w:r>
         <w:r>
           <w:rPr>
@@ -1538,7 +2127,7 @@
             <w:noProof/>
             <w:webHidden/>
           </w:rPr>
-          <w:instrText xml:space="preserve"> PAGEREF _Toc239955057 \h </w:instrText>
+          <w:instrText xml:space="preserve"> PAGEREF _Toc239958282 \h </w:instrText>
         </w:r>
         <w:r>
           <w:rPr>
@@ -1558,483 +2147,7 @@
             <w:noProof/>
             <w:webHidden/>
           </w:rPr>
-          <w:t>9</w:t>
-        </w:r>
-        <w:r>
-          <w:rPr>
-            <w:noProof/>
-            <w:webHidden/>
-          </w:rPr>
-          <w:fldChar w:fldCharType="end"/>
-        </w:r>
-      </w:hyperlink>
-    </w:p>
-    <w:p>
-      <w:pPr>
-        <w:pStyle w:val="TOC3"/>
-        <w:tabs>
-          <w:tab w:val="right" w:leader="dot" w:pos="9350"/>
-        </w:tabs>
-        <w:rPr>
-          <w:noProof/>
-        </w:rPr>
-      </w:pPr>
-      <w:hyperlink w:anchor="_Toc239955058" w:history="1">
-        <w:r>
-          <w:rPr>
-            <w:rStyle w:val="Hyperlink"/>
-            <w:noProof/>
-          </w:rPr>
-          <w:t>4.1 Purpose and Scope of the SRS</w:t>
-        </w:r>
-        <w:r>
-          <w:rPr>
-            <w:noProof/>
-            <w:webHidden/>
-          </w:rPr>
-          <w:tab/>
-        </w:r>
-        <w:r>
-          <w:rPr>
-            <w:noProof/>
-            <w:webHidden/>
-          </w:rPr>
-          <w:fldChar w:fldCharType="begin"/>
-        </w:r>
-        <w:r>
-          <w:rPr>
-            <w:noProof/>
-            <w:webHidden/>
-          </w:rPr>
-          <w:instrText xml:space="preserve"> PAGEREF _Toc239955058 \h </w:instrText>
-        </w:r>
-        <w:r>
-          <w:rPr>
-            <w:noProof/>
-            <w:webHidden/>
-          </w:rPr>
-        </w:r>
-        <w:r>
-          <w:rPr>
-            <w:noProof/>
-            <w:webHidden/>
-          </w:rPr>
-          <w:fldChar w:fldCharType="separate"/>
-        </w:r>
-        <w:r>
-          <w:rPr>
-            <w:noProof/>
-            <w:webHidden/>
-          </w:rPr>
-          <w:t>9</w:t>
-        </w:r>
-        <w:r>
-          <w:rPr>
-            <w:noProof/>
-            <w:webHidden/>
-          </w:rPr>
-          <w:fldChar w:fldCharType="end"/>
-        </w:r>
-      </w:hyperlink>
-    </w:p>
-    <w:p>
-      <w:pPr>
-        <w:pStyle w:val="TOC3"/>
-        <w:tabs>
-          <w:tab w:val="right" w:leader="dot" w:pos="9350"/>
-        </w:tabs>
-        <w:rPr>
-          <w:noProof/>
-        </w:rPr>
-      </w:pPr>
-      <w:hyperlink w:anchor="_Toc239955059" w:history="1">
-        <w:r>
-          <w:rPr>
-            <w:rStyle w:val="Hyperlink"/>
-            <w:noProof/>
-          </w:rPr>
-          <w:t>4.2 Definitions and Acronyms</w:t>
-        </w:r>
-        <w:r>
-          <w:rPr>
-            <w:noProof/>
-            <w:webHidden/>
-          </w:rPr>
-          <w:tab/>
-        </w:r>
-        <w:r>
-          <w:rPr>
-            <w:noProof/>
-            <w:webHidden/>
-          </w:rPr>
-          <w:fldChar w:fldCharType="begin"/>
-        </w:r>
-        <w:r>
-          <w:rPr>
-            <w:noProof/>
-            <w:webHidden/>
-          </w:rPr>
-          <w:instrText xml:space="preserve"> PAGEREF _Toc239955059 \h </w:instrText>
-        </w:r>
-        <w:r>
-          <w:rPr>
-            <w:noProof/>
-            <w:webHidden/>
-          </w:rPr>
-        </w:r>
-        <w:r>
-          <w:rPr>
-            <w:noProof/>
-            <w:webHidden/>
-          </w:rPr>
-          <w:fldChar w:fldCharType="separate"/>
-        </w:r>
-        <w:r>
-          <w:rPr>
-            <w:noProof/>
-            <w:webHidden/>
-          </w:rPr>
-          <w:t>9</w:t>
-        </w:r>
-        <w:r>
-          <w:rPr>
-            <w:noProof/>
-            <w:webHidden/>
-          </w:rPr>
-          <w:fldChar w:fldCharType="end"/>
-        </w:r>
-      </w:hyperlink>
-    </w:p>
-    <w:p>
-      <w:pPr>
-        <w:pStyle w:val="TOC3"/>
-        <w:tabs>
-          <w:tab w:val="right" w:leader="dot" w:pos="9350"/>
-        </w:tabs>
-        <w:rPr>
-          <w:noProof/>
-        </w:rPr>
-      </w:pPr>
-      <w:hyperlink w:anchor="_Toc239955060" w:history="1">
-        <w:r>
-          <w:rPr>
-            <w:rStyle w:val="Hyperlink"/>
-            <w:noProof/>
-          </w:rPr>
-          <w:t>4.3 Actors</w:t>
-        </w:r>
-        <w:r>
-          <w:rPr>
-            <w:noProof/>
-            <w:webHidden/>
-          </w:rPr>
-          <w:tab/>
-        </w:r>
-        <w:r>
-          <w:rPr>
-            <w:noProof/>
-            <w:webHidden/>
-          </w:rPr>
-          <w:fldChar w:fldCharType="begin"/>
-        </w:r>
-        <w:r>
-          <w:rPr>
-            <w:noProof/>
-            <w:webHidden/>
-          </w:rPr>
-          <w:instrText xml:space="preserve"> PAGEREF _Toc239955060 \h </w:instrText>
-        </w:r>
-        <w:r>
-          <w:rPr>
-            <w:noProof/>
-            <w:webHidden/>
-          </w:rPr>
-        </w:r>
-        <w:r>
-          <w:rPr>
-            <w:noProof/>
-            <w:webHidden/>
-          </w:rPr>
-          <w:fldChar w:fldCharType="separate"/>
-        </w:r>
-        <w:r>
-          <w:rPr>
-            <w:noProof/>
-            <w:webHidden/>
-          </w:rPr>
-          <w:t>9</w:t>
-        </w:r>
-        <w:r>
-          <w:rPr>
-            <w:noProof/>
-            <w:webHidden/>
-          </w:rPr>
-          <w:fldChar w:fldCharType="end"/>
-        </w:r>
-      </w:hyperlink>
-    </w:p>
-    <w:p>
-      <w:pPr>
-        <w:pStyle w:val="TOC3"/>
-        <w:tabs>
-          <w:tab w:val="right" w:leader="dot" w:pos="9350"/>
-        </w:tabs>
-        <w:rPr>
-          <w:noProof/>
-        </w:rPr>
-      </w:pPr>
-      <w:hyperlink w:anchor="_Toc239955061" w:history="1">
-        <w:r>
-          <w:rPr>
-            <w:rStyle w:val="Hyperlink"/>
-            <w:noProof/>
-          </w:rPr>
-          <w:t>4.4 Use Cases</w:t>
-        </w:r>
-        <w:r>
-          <w:rPr>
-            <w:noProof/>
-            <w:webHidden/>
-          </w:rPr>
-          <w:tab/>
-        </w:r>
-        <w:r>
-          <w:rPr>
-            <w:noProof/>
-            <w:webHidden/>
-          </w:rPr>
-          <w:fldChar w:fldCharType="begin"/>
-        </w:r>
-        <w:r>
-          <w:rPr>
-            <w:noProof/>
-            <w:webHidden/>
-          </w:rPr>
-          <w:instrText xml:space="preserve"> PAGEREF _Toc239955061 \h </w:instrText>
-        </w:r>
-        <w:r>
-          <w:rPr>
-            <w:noProof/>
-            <w:webHidden/>
-          </w:rPr>
-        </w:r>
-        <w:r>
-          <w:rPr>
-            <w:noProof/>
-            <w:webHidden/>
-          </w:rPr>
-          <w:fldChar w:fldCharType="separate"/>
-        </w:r>
-        <w:r>
-          <w:rPr>
-            <w:noProof/>
-            <w:webHidden/>
-          </w:rPr>
-          <w:t>9</w:t>
-        </w:r>
-        <w:r>
-          <w:rPr>
-            <w:noProof/>
-            <w:webHidden/>
-          </w:rPr>
-          <w:fldChar w:fldCharType="end"/>
-        </w:r>
-      </w:hyperlink>
-    </w:p>
-    <w:p>
-      <w:pPr>
-        <w:pStyle w:val="TOC3"/>
-        <w:tabs>
-          <w:tab w:val="right" w:leader="dot" w:pos="9350"/>
-        </w:tabs>
-        <w:rPr>
-          <w:noProof/>
-        </w:rPr>
-      </w:pPr>
-      <w:hyperlink w:anchor="_Toc239955062" w:history="1">
-        <w:r>
-          <w:rPr>
-            <w:rStyle w:val="Hyperlink"/>
-            <w:noProof/>
-          </w:rPr>
-          <w:t>4.5 Non-Functional Requirements</w:t>
-        </w:r>
-        <w:r>
-          <w:rPr>
-            <w:noProof/>
-            <w:webHidden/>
-          </w:rPr>
-          <w:tab/>
-        </w:r>
-        <w:r>
-          <w:rPr>
-            <w:noProof/>
-            <w:webHidden/>
-          </w:rPr>
-          <w:fldChar w:fldCharType="begin"/>
-        </w:r>
-        <w:r>
-          <w:rPr>
-            <w:noProof/>
-            <w:webHidden/>
-          </w:rPr>
-          <w:instrText xml:space="preserve"> PAGEREF _Toc239955062 \h </w:instrText>
-        </w:r>
-        <w:r>
-          <w:rPr>
-            <w:noProof/>
-            <w:webHidden/>
-          </w:rPr>
-        </w:r>
-        <w:r>
-          <w:rPr>
-            <w:noProof/>
-            <w:webHidden/>
-          </w:rPr>
-          <w:fldChar w:fldCharType="separate"/>
-        </w:r>
-        <w:r>
-          <w:rPr>
-            <w:noProof/>
-            <w:webHidden/>
-          </w:rPr>
-          <w:t>13</w:t>
-        </w:r>
-        <w:r>
-          <w:rPr>
-            <w:noProof/>
-            <w:webHidden/>
-          </w:rPr>
-          <w:fldChar w:fldCharType="end"/>
-        </w:r>
-      </w:hyperlink>
-    </w:p>
-    <w:p>
-      <w:pPr>
-        <w:pStyle w:val="TOC3"/>
-        <w:tabs>
-          <w:tab w:val="right" w:leader="dot" w:pos="9350"/>
-        </w:tabs>
-        <w:rPr>
-          <w:noProof/>
-        </w:rPr>
-      </w:pPr>
-      <w:hyperlink w:anchor="_Toc239955063" w:history="1">
-        <w:r>
-          <w:rPr>
-            <w:rStyle w:val="Hyperlink"/>
-            <w:noProof/>
-          </w:rPr>
-          <w:t>4.6 External Interfaces</w:t>
-        </w:r>
-        <w:r>
-          <w:rPr>
-            <w:noProof/>
-            <w:webHidden/>
-          </w:rPr>
-          <w:tab/>
-        </w:r>
-        <w:r>
-          <w:rPr>
-            <w:noProof/>
-            <w:webHidden/>
-          </w:rPr>
-          <w:fldChar w:fldCharType="begin"/>
-        </w:r>
-        <w:r>
-          <w:rPr>
-            <w:noProof/>
-            <w:webHidden/>
-          </w:rPr>
-          <w:instrText xml:space="preserve"> PAGEREF _Toc239955063 \h </w:instrText>
-        </w:r>
-        <w:r>
-          <w:rPr>
-            <w:noProof/>
-            <w:webHidden/>
-          </w:rPr>
-        </w:r>
-        <w:r>
-          <w:rPr>
-            <w:noProof/>
-            <w:webHidden/>
-          </w:rPr>
-          <w:fldChar w:fldCharType="separate"/>
-        </w:r>
-        <w:r>
-          <w:rPr>
-            <w:noProof/>
-            <w:webHidden/>
-          </w:rPr>
-          <w:t>14</w:t>
-        </w:r>
-        <w:r>
-          <w:rPr>
-            <w:noProof/>
-            <w:webHidden/>
-          </w:rPr>
-          <w:fldChar w:fldCharType="end"/>
-        </w:r>
-      </w:hyperlink>
-    </w:p>
-    <w:p>
-      <w:pPr>
-        <w:pStyle w:val="TOC3"/>
-        <w:tabs>
-          <w:tab w:val="right" w:leader="dot" w:pos="9350"/>
-        </w:tabs>
-        <w:rPr>
-          <w:noProof/>
-        </w:rPr>
-      </w:pPr>
-      <w:hyperlink w:anchor="_Toc239955064" w:history="1">
-        <w:r>
-          <w:rPr>
-            <w:rStyle w:val="Hyperlink"/>
-            <w:noProof/>
-          </w:rPr>
-          <w:t>4.7 Open Items for Future Versions</w:t>
-        </w:r>
-        <w:r>
-          <w:rPr>
-            <w:noProof/>
-            <w:webHidden/>
-          </w:rPr>
-          <w:tab/>
-        </w:r>
-        <w:r>
-          <w:rPr>
-            <w:noProof/>
-            <w:webHidden/>
-          </w:rPr>
-          <w:fldChar w:fldCharType="begin"/>
-        </w:r>
-        <w:r>
-          <w:rPr>
-            <w:noProof/>
-            <w:webHidden/>
-          </w:rPr>
-          <w:instrText xml:space="preserve"> PAGEREF _Toc239955064 \h </w:instrText>
-        </w:r>
-        <w:r>
-          <w:rPr>
-            <w:noProof/>
-            <w:webHidden/>
-          </w:rPr>
-        </w:r>
-        <w:r>
-          <w:rPr>
-            <w:noProof/>
-            <w:webHidden/>
-          </w:rPr>
-          <w:fldChar w:fldCharType="separate"/>
-        </w:r>
-        <w:r>
-          <w:rPr>
-            <w:noProof/>
-            <w:webHidden/>
-          </w:rPr>
-          <w:t>14</w:t>
+          <w:t>15</w:t>
         </w:r>
         <w:r>
           <w:rPr>
@@ -2052,16 +2165,20 @@
           <w:tab w:val="right" w:leader="dot" w:pos="9350"/>
         </w:tabs>
         <w:rPr>
+          <w:rFonts w:eastAsiaTheme="minorEastAsia"/>
           <w:noProof/>
-        </w:rPr>
-      </w:pPr>
-      <w:hyperlink w:anchor="_Toc239955065" w:history="1">
+          <w:kern w:val="2"/>
+          <w:lang w:val="en-AS" w:eastAsia="en-AS"/>
+          <w14:ligatures w14:val="standardContextual"/>
+        </w:rPr>
+      </w:pPr>
+      <w:hyperlink w:anchor="_Toc239958283" w:history="1">
         <w:r>
           <w:rPr>
             <w:rStyle w:val="Hyperlink"/>
             <w:noProof/>
           </w:rPr>
-          <w:t>5. Next Steps</w:t>
+          <w:t>6. References</w:t>
         </w:r>
         <w:r>
           <w:rPr>
@@ -2082,7 +2199,7 @@
             <w:noProof/>
             <w:webHidden/>
           </w:rPr>
-          <w:instrText xml:space="preserve"> PAGEREF _Toc239955065 \h </w:instrText>
+          <w:instrText xml:space="preserve"> PAGEREF _Toc239958283 \h </w:instrText>
         </w:r>
         <w:r>
           <w:rPr>
@@ -2115,74 +2232,6 @@
     </w:p>
     <w:p>
       <w:pPr>
-        <w:pStyle w:val="TOC2"/>
-        <w:tabs>
-          <w:tab w:val="right" w:leader="dot" w:pos="9350"/>
-        </w:tabs>
-        <w:rPr>
-          <w:noProof/>
-        </w:rPr>
-      </w:pPr>
-      <w:hyperlink w:anchor="_Toc239955066" w:history="1">
-        <w:r>
-          <w:rPr>
-            <w:rStyle w:val="Hyperlink"/>
-            <w:noProof/>
-          </w:rPr>
-          <w:t>6. References</w:t>
-        </w:r>
-        <w:r>
-          <w:rPr>
-            <w:noProof/>
-            <w:webHidden/>
-          </w:rPr>
-          <w:tab/>
-        </w:r>
-        <w:r>
-          <w:rPr>
-            <w:noProof/>
-            <w:webHidden/>
-          </w:rPr>
-          <w:fldChar w:fldCharType="begin"/>
-        </w:r>
-        <w:r>
-          <w:rPr>
-            <w:noProof/>
-            <w:webHidden/>
-          </w:rPr>
-          <w:instrText xml:space="preserve"> PAGEREF _Toc239955066 \h </w:instrText>
-        </w:r>
-        <w:r>
-          <w:rPr>
-            <w:noProof/>
-            <w:webHidden/>
-          </w:rPr>
-        </w:r>
-        <w:r>
-          <w:rPr>
-            <w:noProof/>
-            <w:webHidden/>
-          </w:rPr>
-          <w:fldChar w:fldCharType="separate"/>
-        </w:r>
-        <w:r>
-          <w:rPr>
-            <w:noProof/>
-            <w:webHidden/>
-          </w:rPr>
-          <w:t>15</w:t>
-        </w:r>
-        <w:r>
-          <w:rPr>
-            <w:noProof/>
-            <w:webHidden/>
-          </w:rPr>
-          <w:fldChar w:fldCharType="end"/>
-        </w:r>
-      </w:hyperlink>
-    </w:p>
-    <w:p>
-      <w:pPr>
         <w:pStyle w:val="BodyText"/>
       </w:pPr>
       <w:r>
@@ -2198,13 +2247,13 @@
       <w:pPr>
         <w:pStyle w:val="Heading2"/>
       </w:pPr>
-      <w:bookmarkStart w:id="3" w:name="introduction"/>
-      <w:bookmarkStart w:id="4" w:name="_Toc239955040"/>
+      <w:bookmarkStart w:id="2" w:name="introduction"/>
+      <w:bookmarkStart w:id="3" w:name="_Toc239958257"/>
       <w:r>
         <w:lastRenderedPageBreak/>
         <w:t>1. Introduction</w:t>
       </w:r>
-      <w:bookmarkEnd w:id="4"/>
+      <w:bookmarkEnd w:id="3"/>
     </w:p>
     <w:p>
       <w:pPr>
@@ -2226,44 +2275,44 @@
       <w:pPr>
         <w:pStyle w:val="Heading2"/>
       </w:pPr>
-      <w:bookmarkStart w:id="5" w:name="existing-software-landscape-research"/>
-      <w:bookmarkStart w:id="6" w:name="_Toc239955041"/>
-      <w:bookmarkEnd w:id="3"/>
+      <w:bookmarkStart w:id="4" w:name="existing-software-landscape-research"/>
+      <w:bookmarkStart w:id="5" w:name="_Toc239958258"/>
+      <w:bookmarkEnd w:id="2"/>
       <w:r>
         <w:t>2. Existing Software Landscape (Research)</w:t>
       </w:r>
+      <w:bookmarkEnd w:id="5"/>
+    </w:p>
+    <w:p>
+      <w:pPr>
+        <w:pStyle w:val="Heading3"/>
+      </w:pPr>
+      <w:bookmarkStart w:id="6" w:name="purpose-of-the-research"/>
+      <w:bookmarkStart w:id="7" w:name="_Toc239958259"/>
+      <w:r>
+        <w:t>2.1 Purpose of the Research</w:t>
+      </w:r>
+      <w:bookmarkEnd w:id="7"/>
+    </w:p>
+    <w:p>
+      <w:pPr>
+        <w:pStyle w:val="FirstParagraph"/>
+      </w:pPr>
+      <w:r>
+        <w:t>Before writing requirements, we need to know what is already on the market. This tells us three things: which features drivers already expect, which problems are still unsolved, and where we can build something better. Everything in this section feeds into the differentiation strategy in Section 2.5 and the scope decisions in Section 3.7.</w:t>
+      </w:r>
+    </w:p>
+    <w:p>
+      <w:pPr>
+        <w:pStyle w:val="Heading3"/>
+      </w:pPr>
+      <w:bookmarkStart w:id="8" w:name="market-overview"/>
+      <w:bookmarkStart w:id="9" w:name="_Toc239958260"/>
       <w:bookmarkEnd w:id="6"/>
-    </w:p>
-    <w:p>
-      <w:pPr>
-        <w:pStyle w:val="Heading3"/>
-      </w:pPr>
-      <w:bookmarkStart w:id="7" w:name="purpose-of-the-research"/>
-      <w:bookmarkStart w:id="8" w:name="_Toc239955042"/>
-      <w:r>
-        <w:t>2.1 Purpose of the Research</w:t>
-      </w:r>
-      <w:bookmarkEnd w:id="8"/>
-    </w:p>
-    <w:p>
-      <w:pPr>
-        <w:pStyle w:val="FirstParagraph"/>
-      </w:pPr>
-      <w:r>
-        <w:t>Before writing requirements, we need to know what is already on the market. This tells us three things: which features drivers already expect, which problems are still unsolved, and where we can build something better. Everything in this section feeds into the differentiation strategy in Section 2.5 and the scope decisions in Section 3.7.</w:t>
-      </w:r>
-    </w:p>
-    <w:p>
-      <w:pPr>
-        <w:pStyle w:val="Heading3"/>
-      </w:pPr>
-      <w:bookmarkStart w:id="9" w:name="market-overview"/>
-      <w:bookmarkStart w:id="10" w:name="_Toc239955043"/>
-      <w:bookmarkEnd w:id="7"/>
       <w:r>
         <w:t>2.2 Market Overview</w:t>
       </w:r>
-      <w:bookmarkEnd w:id="10"/>
+      <w:bookmarkEnd w:id="9"/>
     </w:p>
     <w:p>
       <w:pPr>
@@ -2544,13 +2593,13 @@
       <w:pPr>
         <w:pStyle w:val="Heading3"/>
       </w:pPr>
-      <w:bookmarkStart w:id="11" w:name="competitor-analysis"/>
-      <w:bookmarkStart w:id="12" w:name="_Toc239955044"/>
-      <w:bookmarkEnd w:id="9"/>
+      <w:bookmarkStart w:id="10" w:name="competitor-analysis"/>
+      <w:bookmarkStart w:id="11" w:name="_Toc239958261"/>
+      <w:bookmarkEnd w:id="8"/>
       <w:r>
         <w:t>2.3 Competitor Analysis</w:t>
       </w:r>
-      <w:bookmarkEnd w:id="12"/>
+      <w:bookmarkEnd w:id="11"/>
     </w:p>
     <w:tbl>
       <w:tblPr>
@@ -3054,13 +3103,13 @@
       <w:pPr>
         <w:pStyle w:val="Heading3"/>
       </w:pPr>
-      <w:bookmarkStart w:id="13" w:name="common-weaknesses-in-current-solutions"/>
-      <w:bookmarkStart w:id="14" w:name="_Toc239955045"/>
-      <w:bookmarkEnd w:id="11"/>
+      <w:bookmarkStart w:id="12" w:name="common-weaknesses-in-current-solutions"/>
+      <w:bookmarkStart w:id="13" w:name="_Toc239958262"/>
+      <w:bookmarkEnd w:id="10"/>
       <w:r>
         <w:t>2.4 Common Weaknesses in Current Solutions</w:t>
       </w:r>
-      <w:bookmarkEnd w:id="14"/>
+      <w:bookmarkEnd w:id="13"/>
     </w:p>
     <w:p>
       <w:pPr>
@@ -3170,13 +3219,13 @@
       <w:pPr>
         <w:pStyle w:val="Heading3"/>
       </w:pPr>
-      <w:bookmarkStart w:id="15" w:name="how-our-platform-will-be-different"/>
-      <w:bookmarkStart w:id="16" w:name="_Toc239955046"/>
-      <w:bookmarkEnd w:id="13"/>
+      <w:bookmarkStart w:id="14" w:name="how-our-platform-will-be-different"/>
+      <w:bookmarkStart w:id="15" w:name="_Toc239958263"/>
+      <w:bookmarkEnd w:id="12"/>
       <w:r>
         <w:t>2.5 How Our Platform Will Be Different</w:t>
       </w:r>
-      <w:bookmarkEnd w:id="16"/>
+      <w:bookmarkEnd w:id="15"/>
     </w:p>
     <w:p>
       <w:pPr>
@@ -3268,128 +3317,128 @@
       <w:pPr>
         <w:pStyle w:val="Heading2"/>
       </w:pPr>
-      <w:bookmarkStart w:id="17" w:name="vision-and-scope"/>
-      <w:bookmarkStart w:id="18" w:name="_Toc239955047"/>
-      <w:bookmarkEnd w:id="5"/>
-      <w:bookmarkEnd w:id="15"/>
+      <w:bookmarkStart w:id="16" w:name="vision-and-scope"/>
+      <w:bookmarkStart w:id="17" w:name="_Toc239958264"/>
+      <w:bookmarkEnd w:id="4"/>
+      <w:bookmarkEnd w:id="14"/>
       <w:r>
         <w:t>3. Vision and Scope</w:t>
       </w:r>
+      <w:bookmarkEnd w:id="17"/>
+    </w:p>
+    <w:p>
+      <w:pPr>
+        <w:pStyle w:val="Heading3"/>
+      </w:pPr>
+      <w:bookmarkStart w:id="18" w:name="about-oftware-orp."/>
+      <w:bookmarkStart w:id="19" w:name="_Toc239958265"/>
+      <w:r>
+        <w:t>3.1 About $oftware ¢orp.</w:t>
+      </w:r>
+      <w:bookmarkEnd w:id="19"/>
+    </w:p>
+    <w:p>
+      <w:pPr>
+        <w:pStyle w:val="FirstParagraph"/>
+      </w:pPr>
+      <w:r>
+        <w:t>$oftware ¢orp. is a software development studio that builds platform products for the transportation and mobility sector. The studio works in cross-functional delivery teams and takes projects from requirements gathering through release and support. For this engagement the studio has committed six teams: Mobile Application, Web Application, Backend/API, Mapping &amp; Location Services, Payment Integration, and Quality Assurance &amp; Testing.</w:t>
+      </w:r>
+    </w:p>
+    <w:p>
+      <w:pPr>
+        <w:pStyle w:val="BodyText"/>
+      </w:pPr>
+      <w:r>
+        <w:t xml:space="preserve">For the purposes of this course, $oftware ¢orp. is a fictitious company operating with an unlimited theoretical development budget. This removes cost as a constraint but does </w:t>
+      </w:r>
+      <w:r>
+        <w:rPr>
+          <w:b/>
+          <w:bCs/>
+        </w:rPr>
+        <w:t>not</w:t>
+      </w:r>
+      <w:r>
+        <w:t xml:space="preserve"> remove the schedule constraint — the semester timeline is fixed.</w:t>
+      </w:r>
+    </w:p>
+    <w:p>
+      <w:pPr>
+        <w:pStyle w:val="Heading3"/>
+      </w:pPr>
+      <w:bookmarkStart w:id="20" w:name="how-this-project-was-acquired"/>
+      <w:bookmarkStart w:id="21" w:name="_Toc239958266"/>
       <w:bookmarkEnd w:id="18"/>
-    </w:p>
-    <w:p>
-      <w:pPr>
-        <w:pStyle w:val="Heading3"/>
-      </w:pPr>
-      <w:bookmarkStart w:id="19" w:name="about-oftware-orp."/>
-      <w:bookmarkStart w:id="20" w:name="_Toc239955048"/>
-      <w:r>
-        <w:t>3.1 About $oftware ¢orp.</w:t>
-      </w:r>
-      <w:bookmarkEnd w:id="20"/>
-    </w:p>
-    <w:p>
-      <w:pPr>
-        <w:pStyle w:val="FirstParagraph"/>
-      </w:pPr>
-      <w:r>
-        <w:t>$oftware ¢orp. is a software development studio that builds platform products for the transportation and mobility sector. The studio works in cross-functional delivery teams and takes projects from requirements gathering through release and support. For this engagement the studio has committed six teams: Mobile Application, Web Application, Backend/API, Mapping &amp; Location Services, Payment Integration, and Quality Assurance &amp; Testing.</w:t>
-      </w:r>
-    </w:p>
-    <w:p>
-      <w:pPr>
-        <w:pStyle w:val="BodyText"/>
-      </w:pPr>
-      <w:r>
-        <w:t xml:space="preserve">For the purposes of this course, $oftware ¢orp. is a fictitious company operating with an unlimited theoretical development budget. This removes cost as a constraint but does </w:t>
-      </w:r>
-      <w:r>
-        <w:rPr>
-          <w:b/>
-          <w:bCs/>
-        </w:rPr>
-        <w:t>not</w:t>
-      </w:r>
-      <w:r>
-        <w:t xml:space="preserve"> remove the schedule constraint — the semester timeline is fixed.</w:t>
-      </w:r>
-    </w:p>
-    <w:p>
-      <w:pPr>
-        <w:pStyle w:val="Heading3"/>
-      </w:pPr>
-      <w:bookmarkStart w:id="21" w:name="how-this-project-was-acquired"/>
-      <w:bookmarkStart w:id="22" w:name="_Toc239955049"/>
-      <w:bookmarkEnd w:id="19"/>
       <w:r>
         <w:lastRenderedPageBreak/>
         <w:t>3.2 How This Project Was Acquired</w:t>
       </w:r>
+      <w:bookmarkEnd w:id="21"/>
+    </w:p>
+    <w:p>
+      <w:pPr>
+        <w:pStyle w:val="FirstParagraph"/>
+      </w:pPr>
+      <w:r>
+        <w:t>A regional parking operator group, together with a municipal transportation department, issued a request for proposal for a real-time parking reservation and management platform. Their existing setup used three separate vendors: one consumer booking app, one gate and access control system, and one spreadsheet-based revenue reporting process. The three did not share data, which caused oversold garages and monthly reconciliation work.</w:t>
+      </w:r>
+    </w:p>
+    <w:p>
+      <w:pPr>
+        <w:pStyle w:val="BodyText"/>
+      </w:pPr>
+      <w:r>
+        <w:t>$oftware ¢orp. was invited to bid based on prior mobility platform work. Our proposal argued that the real problem was not a missing app but a missing single source of truth between the driver and the garage. The client accepted that framing, and the contract was awarded to $oftware ¢orp. as a full platform build covering both the driver-facing product and the operator-facing product.</w:t>
+      </w:r>
+    </w:p>
+    <w:p>
+      <w:pPr>
+        <w:pStyle w:val="BodyText"/>
+      </w:pPr>
+      <w:r>
+        <w:t>The client’s stated priorities, in their order: 1. Never sell a space that is not actually available. 2. Give operators live visibility into occupancy and revenue. 3. Make the driver experience fast enough that it beats circling the block.</w:t>
+      </w:r>
+    </w:p>
+    <w:p>
+      <w:pPr>
+        <w:pStyle w:val="Heading3"/>
+      </w:pPr>
+      <w:bookmarkStart w:id="22" w:name="business-need"/>
+      <w:bookmarkStart w:id="23" w:name="_Toc239958267"/>
+      <w:bookmarkEnd w:id="20"/>
+      <w:r>
+        <w:t>3.3 Business Need</w:t>
+      </w:r>
+      <w:bookmarkEnd w:id="23"/>
+    </w:p>
+    <w:p>
+      <w:pPr>
+        <w:pStyle w:val="FirstParagraph"/>
+      </w:pPr>
+      <w:r>
+        <w:t>Drivers spend a large share of their trip time searching for parking. That searching creates traffic congestion, wasted fuel, driver frustration, and lost productivity. On the other side, parking operators cannot see their own occupancy in real time, so they cannot price dynamically, cannot plan for events, and cannot tell which assets are underused.</w:t>
+      </w:r>
+    </w:p>
+    <w:p>
+      <w:pPr>
+        <w:pStyle w:val="BodyText"/>
+      </w:pPr>
+      <w:r>
+        <w:t>Both problems come from the same missing piece: there is no shared, live, trusted picture of which spaces are open right now.</w:t>
+      </w:r>
+    </w:p>
+    <w:p>
+      <w:pPr>
+        <w:pStyle w:val="Heading3"/>
+      </w:pPr>
+      <w:bookmarkStart w:id="24" w:name="vision-statement"/>
+      <w:bookmarkStart w:id="25" w:name="_Toc239958268"/>
       <w:bookmarkEnd w:id="22"/>
-    </w:p>
-    <w:p>
-      <w:pPr>
-        <w:pStyle w:val="FirstParagraph"/>
-      </w:pPr>
-      <w:r>
-        <w:t>A regional parking operator group, together with a municipal transportation department, issued a request for proposal for a real-time parking reservation and management platform. Their existing setup used three separate vendors: one consumer booking app, one gate and access control system, and one spreadsheet-based revenue reporting process. The three did not share data, which caused oversold garages and monthly reconciliation work.</w:t>
-      </w:r>
-    </w:p>
-    <w:p>
-      <w:pPr>
-        <w:pStyle w:val="BodyText"/>
-      </w:pPr>
-      <w:r>
-        <w:t>$oftware ¢orp. was invited to bid based on prior mobility platform work. Our proposal argued that the real problem was not a missing app but a missing single source of truth between the driver and the garage. The client accepted that framing, and the contract was awarded to $oftware ¢orp. as a full platform build covering both the driver-facing product and the operator-facing product.</w:t>
-      </w:r>
-    </w:p>
-    <w:p>
-      <w:pPr>
-        <w:pStyle w:val="BodyText"/>
-      </w:pPr>
-      <w:r>
-        <w:t>The client’s stated priorities, in their order: 1. Never sell a space that is not actually available. 2. Give operators live visibility into occupancy and revenue. 3. Make the driver experience fast enough that it beats circling the block.</w:t>
-      </w:r>
-    </w:p>
-    <w:p>
-      <w:pPr>
-        <w:pStyle w:val="Heading3"/>
-      </w:pPr>
-      <w:bookmarkStart w:id="23" w:name="business-need"/>
-      <w:bookmarkStart w:id="24" w:name="_Toc239955050"/>
-      <w:bookmarkEnd w:id="21"/>
-      <w:r>
-        <w:t>3.3 Business Need</w:t>
-      </w:r>
-      <w:bookmarkEnd w:id="24"/>
-    </w:p>
-    <w:p>
-      <w:pPr>
-        <w:pStyle w:val="FirstParagraph"/>
-      </w:pPr>
-      <w:r>
-        <w:t>Drivers spend a large share of their trip time searching for parking. That searching creates traffic congestion, wasted fuel, driver frustration, and lost productivity. On the other side, parking operators cannot see their own occupancy in real time, so they cannot price dynamically, cannot plan for events, and cannot tell which assets are underused.</w:t>
-      </w:r>
-    </w:p>
-    <w:p>
-      <w:pPr>
-        <w:pStyle w:val="BodyText"/>
-      </w:pPr>
-      <w:r>
-        <w:t>Both problems come from the same missing piece: there is no shared, live, trusted picture of which spaces are open right now.</w:t>
-      </w:r>
-    </w:p>
-    <w:p>
-      <w:pPr>
-        <w:pStyle w:val="Heading3"/>
-      </w:pPr>
-      <w:bookmarkStart w:id="25" w:name="vision-statement"/>
-      <w:bookmarkStart w:id="26" w:name="_Toc239955051"/>
-      <w:bookmarkEnd w:id="23"/>
       <w:r>
         <w:t>3.4 Vision Statement</w:t>
       </w:r>
-      <w:bookmarkEnd w:id="26"/>
+      <w:bookmarkEnd w:id="25"/>
     </w:p>
     <w:p>
       <w:pPr>
@@ -3470,13 +3519,13 @@
       <w:pPr>
         <w:pStyle w:val="Heading3"/>
       </w:pPr>
-      <w:bookmarkStart w:id="27" w:name="business-objectives-and-success-metrics"/>
-      <w:bookmarkStart w:id="28" w:name="_Toc239955052"/>
-      <w:bookmarkEnd w:id="25"/>
+      <w:bookmarkStart w:id="26" w:name="business-objectives-and-success-metrics"/>
+      <w:bookmarkStart w:id="27" w:name="_Toc239958269"/>
+      <w:bookmarkEnd w:id="24"/>
       <w:r>
         <w:t>3.5 Business Objectives and Success Metrics</w:t>
       </w:r>
-      <w:bookmarkEnd w:id="28"/>
+      <w:bookmarkEnd w:id="27"/>
     </w:p>
     <w:tbl>
       <w:tblPr>
@@ -3745,13 +3794,13 @@
       <w:pPr>
         <w:pStyle w:val="Heading3"/>
       </w:pPr>
-      <w:bookmarkStart w:id="29" w:name="project-overview"/>
-      <w:bookmarkStart w:id="30" w:name="_Toc239955053"/>
-      <w:bookmarkEnd w:id="27"/>
+      <w:bookmarkStart w:id="28" w:name="project-overview"/>
+      <w:bookmarkStart w:id="29" w:name="_Toc239958270"/>
+      <w:bookmarkEnd w:id="26"/>
       <w:r>
         <w:t>3.6 Project Overview</w:t>
       </w:r>
-      <w:bookmarkEnd w:id="30"/>
+      <w:bookmarkEnd w:id="29"/>
     </w:p>
     <w:p>
       <w:pPr>
@@ -3841,13 +3890,13 @@
       <w:pPr>
         <w:pStyle w:val="Heading3"/>
       </w:pPr>
-      <w:bookmarkStart w:id="31" w:name="scope-in-and-out"/>
-      <w:bookmarkStart w:id="32" w:name="_Toc239955054"/>
-      <w:bookmarkEnd w:id="29"/>
+      <w:bookmarkStart w:id="30" w:name="scope-in-and-out"/>
+      <w:bookmarkStart w:id="31" w:name="_Toc239958271"/>
+      <w:bookmarkEnd w:id="28"/>
       <w:r>
         <w:t>3.7 Scope — In and Out</w:t>
       </w:r>
-      <w:bookmarkEnd w:id="32"/>
+      <w:bookmarkEnd w:id="31"/>
     </w:p>
     <w:p>
       <w:pPr>
@@ -4117,13 +4166,13 @@
       <w:pPr>
         <w:pStyle w:val="Heading3"/>
       </w:pPr>
-      <w:bookmarkStart w:id="33" w:name="stakeholders"/>
-      <w:bookmarkStart w:id="34" w:name="_Toc239955055"/>
-      <w:bookmarkEnd w:id="31"/>
+      <w:bookmarkStart w:id="32" w:name="stakeholders"/>
+      <w:bookmarkStart w:id="33" w:name="_Toc239958272"/>
+      <w:bookmarkEnd w:id="30"/>
       <w:r>
         <w:t>3.8 Stakeholders</w:t>
       </w:r>
-      <w:bookmarkEnd w:id="34"/>
+      <w:bookmarkEnd w:id="33"/>
     </w:p>
     <w:tbl>
       <w:tblPr>
@@ -4514,13 +4563,13 @@
       <w:pPr>
         <w:pStyle w:val="Heading3"/>
       </w:pPr>
-      <w:bookmarkStart w:id="35" w:name="constraints-and-assumptions"/>
-      <w:bookmarkStart w:id="36" w:name="_Toc239955056"/>
-      <w:bookmarkEnd w:id="33"/>
+      <w:bookmarkStart w:id="34" w:name="constraints-and-assumptions"/>
+      <w:bookmarkStart w:id="35" w:name="_Toc239958273"/>
+      <w:bookmarkEnd w:id="32"/>
       <w:r>
         <w:t>3.9 Constraints and Assumptions</w:t>
       </w:r>
-      <w:bookmarkEnd w:id="36"/>
+      <w:bookmarkEnd w:id="35"/>
     </w:p>
     <w:p>
       <w:pPr>
@@ -4646,61 +4695,61 @@
       <w:pPr>
         <w:pStyle w:val="Heading2"/>
       </w:pPr>
-      <w:bookmarkStart w:id="37" w:name="X671c9c4d490f0732ba072bcdca550b075eb5f82"/>
-      <w:bookmarkStart w:id="38" w:name="_Toc239955057"/>
-      <w:bookmarkEnd w:id="17"/>
-      <w:bookmarkEnd w:id="35"/>
+      <w:bookmarkStart w:id="36" w:name="X671c9c4d490f0732ba072bcdca550b075eb5f82"/>
+      <w:bookmarkStart w:id="37" w:name="_Toc239958274"/>
+      <w:bookmarkEnd w:id="16"/>
+      <w:bookmarkEnd w:id="34"/>
       <w:r>
         <w:lastRenderedPageBreak/>
         <w:t>4. Software Requirements Specification (Draft)</w:t>
       </w:r>
+      <w:bookmarkEnd w:id="37"/>
+    </w:p>
+    <w:p>
+      <w:pPr>
+        <w:pStyle w:val="BlockText"/>
+      </w:pPr>
+      <w:r>
+        <w:rPr>
+          <w:b/>
+          <w:bCs/>
+        </w:rPr>
+        <w:t>Status:</w:t>
+      </w:r>
+      <w:r>
+        <w:t xml:space="preserve"> Draft, version 1.0. This SRS will grow through the semester. Use cases here are written at a summary level; detailed flows, alternate flows, and acceptance criteria will be expanded in later versions.</w:t>
+      </w:r>
+    </w:p>
+    <w:p>
+      <w:pPr>
+        <w:pStyle w:val="Heading3"/>
+      </w:pPr>
+      <w:bookmarkStart w:id="38" w:name="purpose-and-scope-of-the-srs"/>
+      <w:bookmarkStart w:id="39" w:name="_Toc239958275"/>
+      <w:r>
+        <w:t>4.1 Purpose and Scope of the SRS</w:t>
+      </w:r>
+      <w:bookmarkEnd w:id="39"/>
+    </w:p>
+    <w:p>
+      <w:pPr>
+        <w:pStyle w:val="FirstParagraph"/>
+      </w:pPr>
+      <w:r>
+        <w:t>This SRS describes what the Smart Parking Platform must do. It is written for the $oftware ¢orp. delivery teams, the QA team, and the client stakeholders who will approve the requirements. It covers the driver-facing web and mobile applications, the operator dashboard, and the backend services that support them.</w:t>
+      </w:r>
+    </w:p>
+    <w:p>
+      <w:pPr>
+        <w:pStyle w:val="Heading3"/>
+      </w:pPr>
+      <w:bookmarkStart w:id="40" w:name="definitions-and-acronyms"/>
+      <w:bookmarkStart w:id="41" w:name="_Toc239958276"/>
       <w:bookmarkEnd w:id="38"/>
-    </w:p>
-    <w:p>
-      <w:pPr>
-        <w:pStyle w:val="BlockText"/>
-      </w:pPr>
-      <w:r>
-        <w:rPr>
-          <w:b/>
-          <w:bCs/>
-        </w:rPr>
-        <w:t>Status:</w:t>
-      </w:r>
-      <w:r>
-        <w:t xml:space="preserve"> Draft, version 1.0. This SRS will grow through the semester. Use cases here are written at a summary level; detailed flows, alternate flows, and acceptance criteria will be expanded in later versions.</w:t>
-      </w:r>
-    </w:p>
-    <w:p>
-      <w:pPr>
-        <w:pStyle w:val="Heading3"/>
-      </w:pPr>
-      <w:bookmarkStart w:id="39" w:name="purpose-and-scope-of-the-srs"/>
-      <w:bookmarkStart w:id="40" w:name="_Toc239955058"/>
-      <w:r>
-        <w:t>4.1 Purpose and Scope of the SRS</w:t>
-      </w:r>
-      <w:bookmarkEnd w:id="40"/>
-    </w:p>
-    <w:p>
-      <w:pPr>
-        <w:pStyle w:val="FirstParagraph"/>
-      </w:pPr>
-      <w:r>
-        <w:t>This SRS describes what the Smart Parking Platform must do. It is written for the $oftware ¢orp. delivery teams, the QA team, and the client stakeholders who will approve the requirements. It covers the driver-facing web and mobile applications, the operator dashboard, and the backend services that support them.</w:t>
-      </w:r>
-    </w:p>
-    <w:p>
-      <w:pPr>
-        <w:pStyle w:val="Heading3"/>
-      </w:pPr>
-      <w:bookmarkStart w:id="41" w:name="definitions-and-acronyms"/>
-      <w:bookmarkStart w:id="42" w:name="_Toc239955059"/>
-      <w:bookmarkEnd w:id="39"/>
       <w:r>
         <w:t>4.2 Definitions and Acronyms</w:t>
       </w:r>
-      <w:bookmarkEnd w:id="42"/>
+      <w:bookmarkEnd w:id="41"/>
     </w:p>
     <w:tbl>
       <w:tblPr>
@@ -4973,13 +5022,13 @@
       <w:pPr>
         <w:pStyle w:val="Heading3"/>
       </w:pPr>
-      <w:bookmarkStart w:id="43" w:name="actors"/>
-      <w:bookmarkStart w:id="44" w:name="_Toc239955060"/>
-      <w:bookmarkEnd w:id="41"/>
+      <w:bookmarkStart w:id="42" w:name="actors"/>
+      <w:bookmarkStart w:id="43" w:name="_Toc239958277"/>
+      <w:bookmarkEnd w:id="40"/>
       <w:r>
         <w:t>4.3 Actors</w:t>
       </w:r>
-      <w:bookmarkEnd w:id="44"/>
+      <w:bookmarkEnd w:id="43"/>
     </w:p>
     <w:tbl>
       <w:tblPr>
@@ -5252,19 +5301,19 @@
       <w:pPr>
         <w:pStyle w:val="Heading3"/>
       </w:pPr>
-      <w:bookmarkStart w:id="45" w:name="use-cases"/>
-      <w:bookmarkStart w:id="46" w:name="_Toc239955061"/>
-      <w:bookmarkEnd w:id="43"/>
+      <w:bookmarkStart w:id="44" w:name="use-cases"/>
+      <w:bookmarkStart w:id="45" w:name="_Toc239958278"/>
+      <w:bookmarkEnd w:id="42"/>
       <w:r>
         <w:t>4.4 Use Cases</w:t>
       </w:r>
-      <w:bookmarkEnd w:id="46"/>
+      <w:bookmarkEnd w:id="45"/>
     </w:p>
     <w:p>
       <w:pPr>
         <w:pStyle w:val="Heading4"/>
       </w:pPr>
-      <w:bookmarkStart w:id="47" w:name="uc-01-register-account"/>
+      <w:bookmarkStart w:id="46" w:name="uc-01-register-account"/>
       <w:r>
         <w:t>UC-01 — Register Account</w:t>
       </w:r>
@@ -5342,10 +5391,85 @@
       <w:pPr>
         <w:pStyle w:val="Heading4"/>
       </w:pPr>
-      <w:bookmarkStart w:id="48" w:name="uc-02-authenticate-log-in-log-out"/>
+      <w:bookmarkStart w:id="47" w:name="uc-02-authenticate-log-in-log-out"/>
+      <w:bookmarkEnd w:id="46"/>
+      <w:r>
+        <w:t>UC-02 — Authenticate (Log In / Log Out)</w:t>
+      </w:r>
+    </w:p>
+    <w:p>
+      <w:pPr>
+        <w:pStyle w:val="FirstParagraph"/>
+      </w:pPr>
+      <w:r>
+        <w:rPr>
+          <w:b/>
+          <w:bCs/>
+        </w:rPr>
+        <w:t>Actor:</w:t>
+      </w:r>
+      <w:r>
+        <w:t xml:space="preserve"> Driver, Operator, Finance User, System Administrator </w:t>
+      </w:r>
+      <w:r>
+        <w:rPr>
+          <w:b/>
+          <w:bCs/>
+        </w:rPr>
+        <w:t>Goal:</w:t>
+      </w:r>
+      <w:r>
+        <w:t xml:space="preserve"> Access the account securely. </w:t>
+      </w:r>
+      <w:r>
+        <w:rPr>
+          <w:b/>
+          <w:bCs/>
+        </w:rPr>
+        <w:t>Preconditions:</w:t>
+      </w:r>
+      <w:r>
+        <w:t xml:space="preserve"> A verified account exists. </w:t>
+      </w:r>
+      <w:r>
+        <w:rPr>
+          <w:b/>
+          <w:bCs/>
+        </w:rPr>
+        <w:t>Main flow:</w:t>
+      </w:r>
+      <w:r>
+        <w:t xml:space="preserve"> User submits credentials → system verifies → session is created with the correct role permissions. </w:t>
+      </w:r>
+      <w:r>
+        <w:rPr>
+          <w:b/>
+          <w:bCs/>
+        </w:rPr>
+        <w:t>Alternate flow:</w:t>
+      </w:r>
+      <w:r>
+        <w:t xml:space="preserve"> Wrong credentials three times → account is temporarily locked and a reset email is offered. </w:t>
+      </w:r>
+      <w:r>
+        <w:rPr>
+          <w:b/>
+          <w:bCs/>
+        </w:rPr>
+        <w:t>Postcondition:</w:t>
+      </w:r>
+      <w:r>
+        <w:t xml:space="preserve"> Authenticated session, or access denied.</w:t>
+      </w:r>
+    </w:p>
+    <w:p>
+      <w:pPr>
+        <w:pStyle w:val="Heading4"/>
+      </w:pPr>
+      <w:bookmarkStart w:id="48" w:name="uc-03-manage-vehicle-profile"/>
       <w:bookmarkEnd w:id="47"/>
       <w:r>
-        <w:t>UC-02 — Authenticate (Log In / Log Out)</w:t>
+        <w:t>UC-03 — Manage Vehicle Profile</w:t>
       </w:r>
     </w:p>
     <w:p>
@@ -5360,7 +5484,7 @@
         <w:t>Actor:</w:t>
       </w:r>
       <w:r>
-        <w:t xml:space="preserve"> Driver, Operator, Finance User, System Administrator </w:t>
+        <w:t xml:space="preserve"> Driver </w:t>
       </w:r>
       <w:r>
         <w:rPr>
@@ -5370,7 +5494,7 @@
         <w:t>Goal:</w:t>
       </w:r>
       <w:r>
-        <w:t xml:space="preserve"> Access the account securely. </w:t>
+        <w:t xml:space="preserve"> Save vehicle details and license plate for gate entry. </w:t>
       </w:r>
       <w:r>
         <w:rPr>
@@ -5380,7 +5504,7 @@
         <w:t>Preconditions:</w:t>
       </w:r>
       <w:r>
-        <w:t xml:space="preserve"> A verified account exists. </w:t>
+        <w:t xml:space="preserve"> Driver is logged in. </w:t>
       </w:r>
       <w:r>
         <w:rPr>
@@ -5390,7 +5514,7 @@
         <w:t>Main flow:</w:t>
       </w:r>
       <w:r>
-        <w:t xml:space="preserve"> User submits credentials → system verifies → session is created with the correct role permissions. </w:t>
+        <w:t xml:space="preserve"> Driver adds vehicle make, model, and plate number → system validates the plate format → vehicle is saved and can be set as default. </w:t>
       </w:r>
       <w:r>
         <w:rPr>
@@ -5400,7 +5524,7 @@
         <w:t>Alternate flow:</w:t>
       </w:r>
       <w:r>
-        <w:t xml:space="preserve"> Wrong credentials three times → account is temporarily locked and a reset email is offered. </w:t>
+        <w:t xml:space="preserve"> Duplicate plate on another account → flagged for administrator review. </w:t>
       </w:r>
       <w:r>
         <w:rPr>
@@ -5410,17 +5534,17 @@
         <w:t>Postcondition:</w:t>
       </w:r>
       <w:r>
-        <w:t xml:space="preserve"> Authenticated session, or access denied.</w:t>
+        <w:t xml:space="preserve"> Vehicle is available for LPR entry and for reservations.</w:t>
       </w:r>
     </w:p>
     <w:p>
       <w:pPr>
         <w:pStyle w:val="Heading4"/>
       </w:pPr>
-      <w:bookmarkStart w:id="49" w:name="uc-03-manage-vehicle-profile"/>
+      <w:bookmarkStart w:id="49" w:name="X013a038358698752ec10f59e703fe6375be8689"/>
       <w:bookmarkEnd w:id="48"/>
       <w:r>
-        <w:t>UC-03 — Manage Vehicle Profile</w:t>
+        <w:t>UC-04 — Search for Parking Near a Destination</w:t>
       </w:r>
     </w:p>
     <w:p>
@@ -5435,7 +5559,7 @@
         <w:t>Actor:</w:t>
       </w:r>
       <w:r>
-        <w:t xml:space="preserve"> Driver </w:t>
+        <w:t xml:space="preserve"> Guest, Driver </w:t>
       </w:r>
       <w:r>
         <w:rPr>
@@ -5445,7 +5569,7 @@
         <w:t>Goal:</w:t>
       </w:r>
       <w:r>
-        <w:t xml:space="preserve"> Save vehicle details and license plate for gate entry. </w:t>
+        <w:t xml:space="preserve"> Find garages near a chosen address, landmark, or current location. </w:t>
       </w:r>
       <w:r>
         <w:rPr>
@@ -5455,7 +5579,7 @@
         <w:t>Preconditions:</w:t>
       </w:r>
       <w:r>
-        <w:t xml:space="preserve"> Driver is logged in. </w:t>
+        <w:t xml:space="preserve"> Location access granted, or an address entered. </w:t>
       </w:r>
       <w:r>
         <w:rPr>
@@ -5465,7 +5589,7 @@
         <w:t>Main flow:</w:t>
       </w:r>
       <w:r>
-        <w:t xml:space="preserve"> Driver adds vehicle make, model, and plate number → system validates the plate format → vehicle is saved and can be set as default. </w:t>
+        <w:t xml:space="preserve"> User enters a destination and an arrival/departure time → system queries live inventory → results are returned with distance, price, and available space count. </w:t>
       </w:r>
       <w:r>
         <w:rPr>
@@ -5475,7 +5599,7 @@
         <w:t>Alternate flow:</w:t>
       </w:r>
       <w:r>
-        <w:t xml:space="preserve"> Duplicate plate on another account → flagged for administrator review. </w:t>
+        <w:t xml:space="preserve"> No garages within range → system widens the radius and shows the nearest option. </w:t>
       </w:r>
       <w:r>
         <w:rPr>
@@ -5485,17 +5609,17 @@
         <w:t>Postcondition:</w:t>
       </w:r>
       <w:r>
-        <w:t xml:space="preserve"> Vehicle is available for LPR entry and for reservations.</w:t>
+        <w:t xml:space="preserve"> A result set is displayed.</w:t>
       </w:r>
     </w:p>
     <w:p>
       <w:pPr>
         <w:pStyle w:val="Heading4"/>
       </w:pPr>
-      <w:bookmarkStart w:id="50" w:name="X013a038358698752ec10f59e703fe6375be8689"/>
+      <w:bookmarkStart w:id="50" w:name="Xfb17a245818860a90c17557caf041abbaf0bfb8"/>
       <w:bookmarkEnd w:id="49"/>
       <w:r>
-        <w:t>UC-04 — Search for Parking Near a Destination</w:t>
+        <w:t>UC-05 — View Real-Time Availability on an Interactive Map</w:t>
       </w:r>
     </w:p>
     <w:p>
@@ -5520,7 +5644,7 @@
         <w:t>Goal:</w:t>
       </w:r>
       <w:r>
-        <w:t xml:space="preserve"> Find garages near a chosen address, landmark, or current location. </w:t>
+        <w:t xml:space="preserve"> See where open spaces are, visually. </w:t>
       </w:r>
       <w:r>
         <w:rPr>
@@ -5530,7 +5654,7 @@
         <w:t>Preconditions:</w:t>
       </w:r>
       <w:r>
-        <w:t xml:space="preserve"> Location access granted, or an address entered. </w:t>
+        <w:t xml:space="preserve"> Search results exist. </w:t>
       </w:r>
       <w:r>
         <w:rPr>
@@ -5540,7 +5664,7 @@
         <w:t>Main flow:</w:t>
       </w:r>
       <w:r>
-        <w:t xml:space="preserve"> User enters a destination and an arrival/departure time → system queries live inventory → results are returned with distance, price, and available space count. </w:t>
+        <w:t xml:space="preserve"> System renders garage pins on the map → each pin shows price and live open space count → counts refresh as gate events arrive. </w:t>
       </w:r>
       <w:r>
         <w:rPr>
@@ -5550,7 +5674,7 @@
         <w:t>Alternate flow:</w:t>
       </w:r>
       <w:r>
-        <w:t xml:space="preserve"> No garages within range → system widens the radius and shows the nearest option. </w:t>
+        <w:t xml:space="preserve"> Live occupancy feed is unavailable → the garage is marked “availability estimated” and cannot be reserved as guaranteed. </w:t>
       </w:r>
       <w:r>
         <w:rPr>
@@ -5560,17 +5684,17 @@
         <w:t>Postcondition:</w:t>
       </w:r>
       <w:r>
-        <w:t xml:space="preserve"> A result set is displayed.</w:t>
+        <w:t xml:space="preserve"> Driver can compare options at a glance.</w:t>
       </w:r>
     </w:p>
     <w:p>
       <w:pPr>
         <w:pStyle w:val="Heading4"/>
       </w:pPr>
-      <w:bookmarkStart w:id="51" w:name="Xfb17a245818860a90c17557caf041abbaf0bfb8"/>
+      <w:bookmarkStart w:id="51" w:name="uc-06-filter-and-sort-results"/>
       <w:bookmarkEnd w:id="50"/>
       <w:r>
-        <w:t>UC-05 — View Real-Time Availability on an Interactive Map</w:t>
+        <w:t>UC-06 — Filter and Sort Results</w:t>
       </w:r>
     </w:p>
     <w:p>
@@ -5595,7 +5719,7 @@
         <w:t>Goal:</w:t>
       </w:r>
       <w:r>
-        <w:t xml:space="preserve"> See where open spaces are, visually. </w:t>
+        <w:t xml:space="preserve"> Narrow results to what actually fits the driver’s needs. </w:t>
       </w:r>
       <w:r>
         <w:rPr>
@@ -5615,7 +5739,7 @@
         <w:t>Main flow:</w:t>
       </w:r>
       <w:r>
-        <w:t xml:space="preserve"> System renders garage pins on the map → each pin shows price and live open space count → counts refresh as gate events arrive. </w:t>
+        <w:t xml:space="preserve"> User applies filters (price ceiling, walking distance, covered parking, height clearance, accessible spaces, EV-adjacent) and sorts by price or distance. </w:t>
       </w:r>
       <w:r>
         <w:rPr>
@@ -5625,7 +5749,7 @@
         <w:t>Alternate flow:</w:t>
       </w:r>
       <w:r>
-        <w:t xml:space="preserve"> Live occupancy feed is unavailable → the garage is marked “availability estimated” and cannot be reserved as guaranteed. </w:t>
+        <w:t xml:space="preserve"> Filters return zero results → system suggests which filter to relax. </w:t>
       </w:r>
       <w:r>
         <w:rPr>
@@ -5635,90 +5759,15 @@
         <w:t>Postcondition:</w:t>
       </w:r>
       <w:r>
-        <w:t xml:space="preserve"> Driver can compare options at a glance.</w:t>
+        <w:t xml:space="preserve"> A filtered, sorted result set is displayed.</w:t>
       </w:r>
     </w:p>
     <w:p>
       <w:pPr>
         <w:pStyle w:val="Heading4"/>
       </w:pPr>
-      <w:bookmarkStart w:id="52" w:name="uc-06-filter-and-sort-results"/>
+      <w:bookmarkStart w:id="52" w:name="uc-07-view-garage-details"/>
       <w:bookmarkEnd w:id="51"/>
-      <w:r>
-        <w:t>UC-06 — Filter and Sort Results</w:t>
-      </w:r>
-    </w:p>
-    <w:p>
-      <w:pPr>
-        <w:pStyle w:val="FirstParagraph"/>
-      </w:pPr>
-      <w:r>
-        <w:rPr>
-          <w:b/>
-          <w:bCs/>
-        </w:rPr>
-        <w:t>Actor:</w:t>
-      </w:r>
-      <w:r>
-        <w:t xml:space="preserve"> Guest, Driver </w:t>
-      </w:r>
-      <w:r>
-        <w:rPr>
-          <w:b/>
-          <w:bCs/>
-        </w:rPr>
-        <w:t>Goal:</w:t>
-      </w:r>
-      <w:r>
-        <w:t xml:space="preserve"> Narrow results to what actually fits the driver’s needs. </w:t>
-      </w:r>
-      <w:r>
-        <w:rPr>
-          <w:b/>
-          <w:bCs/>
-        </w:rPr>
-        <w:t>Preconditions:</w:t>
-      </w:r>
-      <w:r>
-        <w:t xml:space="preserve"> Search results exist. </w:t>
-      </w:r>
-      <w:r>
-        <w:rPr>
-          <w:b/>
-          <w:bCs/>
-        </w:rPr>
-        <w:t>Main flow:</w:t>
-      </w:r>
-      <w:r>
-        <w:t xml:space="preserve"> User applies filters (price ceiling, walking distance, covered parking, height clearance, accessible spaces, EV-adjacent) and sorts by price or distance. </w:t>
-      </w:r>
-      <w:r>
-        <w:rPr>
-          <w:b/>
-          <w:bCs/>
-        </w:rPr>
-        <w:t>Alternate flow:</w:t>
-      </w:r>
-      <w:r>
-        <w:t xml:space="preserve"> Filters return zero results → system suggests which filter to relax. </w:t>
-      </w:r>
-      <w:r>
-        <w:rPr>
-          <w:b/>
-          <w:bCs/>
-        </w:rPr>
-        <w:t>Postcondition:</w:t>
-      </w:r>
-      <w:r>
-        <w:t xml:space="preserve"> A filtered, sorted result set is displayed.</w:t>
-      </w:r>
-    </w:p>
-    <w:p>
-      <w:pPr>
-        <w:pStyle w:val="Heading4"/>
-      </w:pPr>
-      <w:bookmarkStart w:id="53" w:name="uc-07-view-garage-details"/>
-      <w:bookmarkEnd w:id="52"/>
       <w:r>
         <w:t>UC-07 — View Garage Details</w:t>
       </w:r>
@@ -5786,10 +5835,85 @@
       <w:pPr>
         <w:pStyle w:val="Heading4"/>
       </w:pPr>
-      <w:bookmarkStart w:id="54" w:name="uc-08-reserve-a-parking-space"/>
+      <w:bookmarkStart w:id="53" w:name="uc-08-reserve-a-parking-space"/>
+      <w:bookmarkEnd w:id="52"/>
+      <w:r>
+        <w:t>UC-08 — Reserve a Parking Space</w:t>
+      </w:r>
+    </w:p>
+    <w:p>
+      <w:pPr>
+        <w:pStyle w:val="FirstParagraph"/>
+      </w:pPr>
+      <w:r>
+        <w:rPr>
+          <w:b/>
+          <w:bCs/>
+        </w:rPr>
+        <w:t>Actor:</w:t>
+      </w:r>
+      <w:r>
+        <w:t xml:space="preserve"> Driver </w:t>
+      </w:r>
+      <w:r>
+        <w:rPr>
+          <w:b/>
+          <w:bCs/>
+        </w:rPr>
+        <w:t>Goal:</w:t>
+      </w:r>
+      <w:r>
+        <w:t xml:space="preserve"> Hold a specific space for a specific time window. </w:t>
+      </w:r>
+      <w:r>
+        <w:rPr>
+          <w:b/>
+          <w:bCs/>
+        </w:rPr>
+        <w:t>Preconditions:</w:t>
+      </w:r>
+      <w:r>
+        <w:t xml:space="preserve"> Driver is logged in; the garage reports verified availability. </w:t>
+      </w:r>
+      <w:r>
+        <w:rPr>
+          <w:b/>
+          <w:bCs/>
+        </w:rPr>
+        <w:t>Main flow:</w:t>
+      </w:r>
+      <w:r>
+        <w:t xml:space="preserve"> Driver selects garage and time window → system places a temporary hold on a space → driver confirms → system proceeds to payment (UC-09). </w:t>
+      </w:r>
+      <w:r>
+        <w:rPr>
+          <w:b/>
+          <w:bCs/>
+        </w:rPr>
+        <w:t>Alternate flow:</w:t>
+      </w:r>
+      <w:r>
+        <w:t xml:space="preserve"> The last space is taken during the hold → system releases the flow and offers the nearest comparable garage. </w:t>
+      </w:r>
+      <w:r>
+        <w:rPr>
+          <w:b/>
+          <w:bCs/>
+        </w:rPr>
+        <w:t>Postcondition:</w:t>
+      </w:r>
+      <w:r>
+        <w:t xml:space="preserve"> A pending reservation exists, awaiting payment.</w:t>
+      </w:r>
+    </w:p>
+    <w:p>
+      <w:pPr>
+        <w:pStyle w:val="Heading4"/>
+      </w:pPr>
+      <w:bookmarkStart w:id="54" w:name="uc-09-pay-for-a-reservation"/>
       <w:bookmarkEnd w:id="53"/>
       <w:r>
-        <w:t>UC-08 — Reserve a Parking Space</w:t>
+        <w:t>UC-09 — Pay for a Reservation</w:t>
       </w:r>
     </w:p>
     <w:p>
@@ -5804,6 +5928,81 @@
         <w:t>Actor:</w:t>
       </w:r>
       <w:r>
+        <w:t xml:space="preserve"> Driver, Payment Gateway </w:t>
+      </w:r>
+      <w:r>
+        <w:rPr>
+          <w:b/>
+          <w:bCs/>
+        </w:rPr>
+        <w:t>Goal:</w:t>
+      </w:r>
+      <w:r>
+        <w:t xml:space="preserve"> Complete payment and confirm the reservation. </w:t>
+      </w:r>
+      <w:r>
+        <w:rPr>
+          <w:b/>
+          <w:bCs/>
+        </w:rPr>
+        <w:t>Preconditions:</w:t>
+      </w:r>
+      <w:r>
+        <w:t xml:space="preserve"> A pending reservation exists. </w:t>
+      </w:r>
+      <w:r>
+        <w:rPr>
+          <w:b/>
+          <w:bCs/>
+        </w:rPr>
+        <w:t>Main flow:</w:t>
+      </w:r>
+      <w:r>
+        <w:t xml:space="preserve"> Driver selects a saved or new payment method → system displays the itemized total → driver confirms → system sends the charge to the payment gateway → gateway approves → reservation is confirmed. </w:t>
+      </w:r>
+      <w:r>
+        <w:rPr>
+          <w:b/>
+          <w:bCs/>
+        </w:rPr>
+        <w:t>Alternate flow:</w:t>
+      </w:r>
+      <w:r>
+        <w:t xml:space="preserve"> Payment declined → reservation hold is kept for 5 minutes and the driver may retry with another method. </w:t>
+      </w:r>
+      <w:r>
+        <w:rPr>
+          <w:b/>
+          <w:bCs/>
+        </w:rPr>
+        <w:t>Postcondition:</w:t>
+      </w:r>
+      <w:r>
+        <w:t xml:space="preserve"> Reservation is confirmed and paid; the space is removed from live inventory.</w:t>
+      </w:r>
+    </w:p>
+    <w:p>
+      <w:pPr>
+        <w:pStyle w:val="Heading4"/>
+      </w:pPr>
+      <w:bookmarkStart w:id="55" w:name="Xb1d3d8d567c0860c64187172b605e69688a0c16"/>
+      <w:bookmarkEnd w:id="54"/>
+      <w:r>
+        <w:t>UC-10 — Receive Booking Confirmation and Entry Pass</w:t>
+      </w:r>
+    </w:p>
+    <w:p>
+      <w:pPr>
+        <w:pStyle w:val="FirstParagraph"/>
+      </w:pPr>
+      <w:r>
+        <w:rPr>
+          <w:b/>
+          <w:bCs/>
+        </w:rPr>
+        <w:t>Actor:</w:t>
+      </w:r>
+      <w:r>
         <w:t xml:space="preserve"> Driver </w:t>
       </w:r>
       <w:r>
@@ -5814,7 +6013,7 @@
         <w:t>Goal:</w:t>
       </w:r>
       <w:r>
-        <w:t xml:space="preserve"> Hold a specific space for a specific time window. </w:t>
+        <w:t xml:space="preserve"> Get proof of the reservation and the credential needed at the gate. </w:t>
       </w:r>
       <w:r>
         <w:rPr>
@@ -5824,7 +6023,7 @@
         <w:t>Preconditions:</w:t>
       </w:r>
       <w:r>
-        <w:t xml:space="preserve"> Driver is logged in; the garage reports verified availability. </w:t>
+        <w:t xml:space="preserve"> Payment succeeded. </w:t>
       </w:r>
       <w:r>
         <w:rPr>
@@ -5834,7 +6033,7 @@
         <w:t>Main flow:</w:t>
       </w:r>
       <w:r>
-        <w:t xml:space="preserve"> Driver selects garage and time window → system places a temporary hold on a space → driver confirms → system proceeds to payment (UC-09). </w:t>
+        <w:t xml:space="preserve"> System issues a dynamic QR entry pass and registers the driver’s plate with the garage → confirmation is delivered in-app and by email. </w:t>
       </w:r>
       <w:r>
         <w:rPr>
@@ -5844,7 +6043,7 @@
         <w:t>Alternate flow:</w:t>
       </w:r>
       <w:r>
-        <w:t xml:space="preserve"> The last space is taken during the hold → system releases the flow and offers the nearest comparable garage. </w:t>
+        <w:t xml:space="preserve"> Email delivery fails → the pass remains available in the app and by SMS. </w:t>
       </w:r>
       <w:r>
         <w:rPr>
@@ -5854,17 +6053,17 @@
         <w:t>Postcondition:</w:t>
       </w:r>
       <w:r>
-        <w:t xml:space="preserve"> A pending reservation exists, awaiting payment.</w:t>
+        <w:t xml:space="preserve"> Driver holds a valid entry credential.</w:t>
       </w:r>
     </w:p>
     <w:p>
       <w:pPr>
         <w:pStyle w:val="Heading4"/>
       </w:pPr>
-      <w:bookmarkStart w:id="55" w:name="uc-09-pay-for-a-reservation"/>
-      <w:bookmarkEnd w:id="54"/>
-      <w:r>
-        <w:t>UC-09 — Pay for a Reservation</w:t>
+      <w:bookmarkStart w:id="56" w:name="uc-11-navigate-to-the-garage"/>
+      <w:bookmarkEnd w:id="55"/>
+      <w:r>
+        <w:t>UC-11 — Navigate to the Garage</w:t>
       </w:r>
     </w:p>
     <w:p>
@@ -5879,7 +6078,7 @@
         <w:t>Actor:</w:t>
       </w:r>
       <w:r>
-        <w:t xml:space="preserve"> Driver, Payment Gateway </w:t>
+        <w:t xml:space="preserve"> Driver, Mapping Service </w:t>
       </w:r>
       <w:r>
         <w:rPr>
@@ -5889,7 +6088,7 @@
         <w:t>Goal:</w:t>
       </w:r>
       <w:r>
-        <w:t xml:space="preserve"> Complete payment and confirm the reservation. </w:t>
+        <w:t xml:space="preserve"> Get turn-by-turn directions to the reserved garage entrance. </w:t>
       </w:r>
       <w:r>
         <w:rPr>
@@ -5899,7 +6098,7 @@
         <w:t>Preconditions:</w:t>
       </w:r>
       <w:r>
-        <w:t xml:space="preserve"> A pending reservation exists. </w:t>
+        <w:t xml:space="preserve"> A confirmed reservation exists. </w:t>
       </w:r>
       <w:r>
         <w:rPr>
@@ -5909,7 +6108,7 @@
         <w:t>Main flow:</w:t>
       </w:r>
       <w:r>
-        <w:t xml:space="preserve"> Driver selects a saved or new payment method → system displays the itemized total → driver confirms → system sends the charge to the payment gateway → gateway approves → reservation is confirmed. </w:t>
+        <w:t xml:space="preserve"> Driver taps “Navigate” → system hands the garage entrance coordinates to the mapping service → navigation begins. </w:t>
       </w:r>
       <w:r>
         <w:rPr>
@@ -5919,7 +6118,7 @@
         <w:t>Alternate flow:</w:t>
       </w:r>
       <w:r>
-        <w:t xml:space="preserve"> Payment declined → reservation hold is kept for 5 minutes and the driver may retry with another method. </w:t>
+        <w:t xml:space="preserve"> Mapping service unavailable → system displays written directions and the entrance address. </w:t>
       </w:r>
       <w:r>
         <w:rPr>
@@ -5929,17 +6128,17 @@
         <w:t>Postcondition:</w:t>
       </w:r>
       <w:r>
-        <w:t xml:space="preserve"> Reservation is confirmed and paid; the space is removed from live inventory.</w:t>
+        <w:t xml:space="preserve"> Driver is routed to the correct entrance, not just the building.</w:t>
       </w:r>
     </w:p>
     <w:p>
       <w:pPr>
         <w:pStyle w:val="Heading4"/>
       </w:pPr>
-      <w:bookmarkStart w:id="56" w:name="Xb1d3d8d567c0860c64187172b605e69688a0c16"/>
-      <w:bookmarkEnd w:id="55"/>
-      <w:r>
-        <w:t>UC-10 — Receive Booking Confirmation and Entry Pass</w:t>
+      <w:bookmarkStart w:id="57" w:name="uc-12-enter-the-garage"/>
+      <w:bookmarkEnd w:id="56"/>
+      <w:r>
+        <w:t>UC-12 — Enter the Garage</w:t>
       </w:r>
     </w:p>
     <w:p>
@@ -5954,7 +6153,7 @@
         <w:t>Actor:</w:t>
       </w:r>
       <w:r>
-        <w:t xml:space="preserve"> Driver </w:t>
+        <w:t xml:space="preserve"> Driver, Garage Hardware </w:t>
       </w:r>
       <w:r>
         <w:rPr>
@@ -5964,7 +6163,7 @@
         <w:t>Goal:</w:t>
       </w:r>
       <w:r>
-        <w:t xml:space="preserve"> Get proof of the reservation and the credential needed at the gate. </w:t>
+        <w:t xml:space="preserve"> Get through the gate without friction. </w:t>
       </w:r>
       <w:r>
         <w:rPr>
@@ -5974,7 +6173,7 @@
         <w:t>Preconditions:</w:t>
       </w:r>
       <w:r>
-        <w:t xml:space="preserve"> Payment succeeded. </w:t>
+        <w:t xml:space="preserve"> A valid, currently active reservation exists. </w:t>
       </w:r>
       <w:r>
         <w:rPr>
@@ -5984,17 +6183,27 @@
         <w:t>Main flow:</w:t>
       </w:r>
       <w:r>
-        <w:t xml:space="preserve"> System issues a dynamic QR entry pass and registers the driver’s plate with the garage → confirmation is delivered in-app and by email. </w:t>
-      </w:r>
-      <w:r>
-        <w:rPr>
-          <w:b/>
-          <w:bCs/>
-        </w:rPr>
-        <w:t>Alternate flow:</w:t>
-      </w:r>
-      <w:r>
-        <w:t xml:space="preserve"> Email delivery fails → the pass remains available in the app and by SMS. </w:t>
+        <w:t xml:space="preserve"> LPR camera reads the plate and matches it to the reservation → gate opens → entry event is recorded and occupancy updates. </w:t>
+      </w:r>
+      <w:r>
+        <w:rPr>
+          <w:b/>
+          <w:bCs/>
+        </w:rPr>
+        <w:t>Alternate flow 1:</w:t>
+      </w:r>
+      <w:r>
+        <w:t xml:space="preserve"> LPR fails → driver scans the QR pass at the reader. </w:t>
+      </w:r>
+      <w:r>
+        <w:rPr>
+          <w:b/>
+          <w:bCs/>
+        </w:rPr>
+        <w:t>Alternate flow 2:</w:t>
+      </w:r>
+      <w:r>
+        <w:t xml:space="preserve"> Both fail → in-app support code opens the gate and an incident is logged. </w:t>
       </w:r>
       <w:r>
         <w:rPr>
@@ -6004,175 +6213,15 @@
         <w:t>Postcondition:</w:t>
       </w:r>
       <w:r>
-        <w:t xml:space="preserve"> Driver holds a valid entry credential.</w:t>
+        <w:t xml:space="preserve"> Driver is parked; occupancy count is updated everywhere.</w:t>
       </w:r>
     </w:p>
     <w:p>
       <w:pPr>
         <w:pStyle w:val="Heading4"/>
       </w:pPr>
-      <w:bookmarkStart w:id="57" w:name="uc-11-navigate-to-the-garage"/>
-      <w:bookmarkEnd w:id="56"/>
-      <w:r>
-        <w:t>UC-11 — Navigate to the Garage</w:t>
-      </w:r>
-    </w:p>
-    <w:p>
-      <w:pPr>
-        <w:pStyle w:val="FirstParagraph"/>
-      </w:pPr>
-      <w:r>
-        <w:rPr>
-          <w:b/>
-          <w:bCs/>
-        </w:rPr>
-        <w:t>Actor:</w:t>
-      </w:r>
-      <w:r>
-        <w:t xml:space="preserve"> Driver, Mapping Service </w:t>
-      </w:r>
-      <w:r>
-        <w:rPr>
-          <w:b/>
-          <w:bCs/>
-        </w:rPr>
-        <w:t>Goal:</w:t>
-      </w:r>
-      <w:r>
-        <w:t xml:space="preserve"> Get turn-by-turn directions to the reserved garage entrance. </w:t>
-      </w:r>
-      <w:r>
-        <w:rPr>
-          <w:b/>
-          <w:bCs/>
-        </w:rPr>
-        <w:t>Preconditions:</w:t>
-      </w:r>
-      <w:r>
-        <w:t xml:space="preserve"> A confirmed reservation exists. </w:t>
-      </w:r>
-      <w:r>
-        <w:rPr>
-          <w:b/>
-          <w:bCs/>
-        </w:rPr>
-        <w:t>Main flow:</w:t>
-      </w:r>
-      <w:r>
-        <w:t xml:space="preserve"> Driver taps “Navigate” → system hands the garage entrance coordinates to the mapping service → navigation begins. </w:t>
-      </w:r>
-      <w:r>
-        <w:rPr>
-          <w:b/>
-          <w:bCs/>
-        </w:rPr>
-        <w:t>Alternate flow:</w:t>
-      </w:r>
-      <w:r>
-        <w:t xml:space="preserve"> Mapping service unavailable → system displays written directions and the entrance address. </w:t>
-      </w:r>
-      <w:r>
-        <w:rPr>
-          <w:b/>
-          <w:bCs/>
-        </w:rPr>
-        <w:t>Postcondition:</w:t>
-      </w:r>
-      <w:r>
-        <w:t xml:space="preserve"> Driver is routed to the correct entrance, not just the building.</w:t>
-      </w:r>
-    </w:p>
-    <w:p>
-      <w:pPr>
-        <w:pStyle w:val="Heading4"/>
-      </w:pPr>
-      <w:bookmarkStart w:id="58" w:name="uc-12-enter-the-garage"/>
+      <w:bookmarkStart w:id="58" w:name="uc-13-extend-an-active-reservation"/>
       <w:bookmarkEnd w:id="57"/>
-      <w:r>
-        <w:t>UC-12 — Enter the Garage</w:t>
-      </w:r>
-    </w:p>
-    <w:p>
-      <w:pPr>
-        <w:pStyle w:val="FirstParagraph"/>
-      </w:pPr>
-      <w:r>
-        <w:rPr>
-          <w:b/>
-          <w:bCs/>
-        </w:rPr>
-        <w:t>Actor:</w:t>
-      </w:r>
-      <w:r>
-        <w:t xml:space="preserve"> Driver, Garage Hardware </w:t>
-      </w:r>
-      <w:r>
-        <w:rPr>
-          <w:b/>
-          <w:bCs/>
-        </w:rPr>
-        <w:t>Goal:</w:t>
-      </w:r>
-      <w:r>
-        <w:t xml:space="preserve"> Get through the gate without friction. </w:t>
-      </w:r>
-      <w:r>
-        <w:rPr>
-          <w:b/>
-          <w:bCs/>
-        </w:rPr>
-        <w:t>Preconditions:</w:t>
-      </w:r>
-      <w:r>
-        <w:t xml:space="preserve"> A valid, currently active reservation exists. </w:t>
-      </w:r>
-      <w:r>
-        <w:rPr>
-          <w:b/>
-          <w:bCs/>
-        </w:rPr>
-        <w:t>Main flow:</w:t>
-      </w:r>
-      <w:r>
-        <w:t xml:space="preserve"> LPR camera reads the plate and matches it to the reservation → gate opens → entry event is recorded and occupancy updates. </w:t>
-      </w:r>
-      <w:r>
-        <w:rPr>
-          <w:b/>
-          <w:bCs/>
-        </w:rPr>
-        <w:t>Alternate flow 1:</w:t>
-      </w:r>
-      <w:r>
-        <w:t xml:space="preserve"> LPR fails → driver scans the QR pass at the reader. </w:t>
-      </w:r>
-      <w:r>
-        <w:rPr>
-          <w:b/>
-          <w:bCs/>
-        </w:rPr>
-        <w:t>Alternate flow 2:</w:t>
-      </w:r>
-      <w:r>
-        <w:t xml:space="preserve"> Both fail → in-app support code opens the gate and an incident is logged. </w:t>
-      </w:r>
-      <w:r>
-        <w:rPr>
-          <w:b/>
-          <w:bCs/>
-        </w:rPr>
-        <w:t>Postcondition:</w:t>
-      </w:r>
-      <w:r>
-        <w:t xml:space="preserve"> Driver is parked; occupancy count is updated everywhere.</w:t>
-      </w:r>
-    </w:p>
-    <w:p>
-      <w:pPr>
-        <w:pStyle w:val="Heading4"/>
-      </w:pPr>
-      <w:bookmarkStart w:id="59" w:name="uc-13-extend-an-active-reservation"/>
-      <w:bookmarkEnd w:id="58"/>
       <w:r>
         <w:lastRenderedPageBreak/>
         <w:t>UC-13 — Extend an Active Reservation</w:t>
@@ -6240,17 +6289,98 @@
         <w:t>Postcondition:</w:t>
       </w:r>
       <w:r>
-        <w:t xml:space="preserve"> Reservation end time is updated, or the extension is denied with a clear reason.</w:t>
+        <w:t xml:space="preserve"> Reservation end time is u</w:t>
+      </w:r>
+      <w:r>
+        <w:t>pdated, or the extension is denied with a clear reason.</w:t>
       </w:r>
     </w:p>
     <w:p>
       <w:pPr>
         <w:pStyle w:val="Heading4"/>
       </w:pPr>
-      <w:bookmarkStart w:id="60" w:name="Xff8c21083df62b73a98755d3eb9842107e3fe45"/>
+      <w:bookmarkStart w:id="59" w:name="Xff8c21083df62b73a98755d3eb9842107e3fe45"/>
+      <w:bookmarkEnd w:id="58"/>
+      <w:r>
+        <w:t>UC-14 — Cancel a Reservation and Receive a Refund</w:t>
+      </w:r>
+    </w:p>
+    <w:p>
+      <w:pPr>
+        <w:pStyle w:val="FirstParagraph"/>
+      </w:pPr>
+      <w:r>
+        <w:rPr>
+          <w:b/>
+          <w:bCs/>
+        </w:rPr>
+        <w:t>Actor:</w:t>
+      </w:r>
+      <w:r>
+        <w:t xml:space="preserve"> Driver, Payment Gateway </w:t>
+      </w:r>
+      <w:r>
+        <w:rPr>
+          <w:b/>
+          <w:bCs/>
+        </w:rPr>
+        <w:t>Goal:</w:t>
+      </w:r>
+      <w:r>
+        <w:t xml:space="preserve"> Cancel and get money back under the stated policy. </w:t>
+      </w:r>
+      <w:r>
+        <w:rPr>
+          <w:b/>
+          <w:bCs/>
+        </w:rPr>
+        <w:t>Preconditions:</w:t>
+      </w:r>
+      <w:r>
+        <w:t xml:space="preserve"> A confirmed reservation exists that has not yet started. </w:t>
+      </w:r>
+      <w:r>
+        <w:rPr>
+          <w:b/>
+          <w:bCs/>
+        </w:rPr>
+        <w:t>Main flow:</w:t>
+      </w:r>
+      <w:r>
+        <w:t xml:space="preserve"> Driver cancels → system applies the cancellation policy → refund is issued through the gateway → the space returns to live inventory. </w:t>
+      </w:r>
+      <w:r>
+        <w:rPr>
+          <w:b/>
+          <w:bCs/>
+        </w:rPr>
+        <w:t>Alternate flow:</w:t>
+      </w:r>
+      <w:r>
+        <w:t xml:space="preserve"> Cancellation is inside the no-refund window → system states the policy and asks for confirmation before cancelling without refund. </w:t>
+      </w:r>
+      <w:r>
+        <w:rPr>
+          <w:b/>
+          <w:bCs/>
+        </w:rPr>
+        <w:t>Postcondition:</w:t>
+      </w:r>
+      <w:r>
+        <w:t xml:space="preserve"> Reservation is cancelled; inventory and finances ar</w:t>
+      </w:r>
+      <w:r>
+        <w:t>e consistent.</w:t>
+      </w:r>
+    </w:p>
+    <w:p>
+      <w:pPr>
+        <w:pStyle w:val="Heading4"/>
+      </w:pPr>
+      <w:bookmarkStart w:id="60" w:name="X4ec992de1f5d66f492af412891f09aa5ac04e15"/>
       <w:bookmarkEnd w:id="59"/>
       <w:r>
-        <w:t>UC-14 — Cancel a Reservation and Receive a Refund</w:t>
+        <w:t>UC-15 — View Reservation History and Receipts</w:t>
       </w:r>
     </w:p>
     <w:p>
@@ -6265,7 +6395,7 @@
         <w:t>Actor:</w:t>
       </w:r>
       <w:r>
-        <w:t xml:space="preserve"> Driver, Payment Gateway </w:t>
+        <w:t xml:space="preserve"> Driver </w:t>
       </w:r>
       <w:r>
         <w:rPr>
@@ -6275,7 +6405,7 @@
         <w:t>Goal:</w:t>
       </w:r>
       <w:r>
-        <w:t xml:space="preserve"> Cancel and get money back under the stated policy. </w:t>
+        <w:t xml:space="preserve"> Look up past parking and download receipts for expenses. </w:t>
       </w:r>
       <w:r>
         <w:rPr>
@@ -6285,7 +6415,7 @@
         <w:t>Preconditions:</w:t>
       </w:r>
       <w:r>
-        <w:t xml:space="preserve"> A confirmed reservation exists that has not yet started. </w:t>
+        <w:t xml:space="preserve"> Driver is logged in with at least one past reservation. </w:t>
       </w:r>
       <w:r>
         <w:rPr>
@@ -6295,7 +6425,72 @@
         <w:t>Main flow:</w:t>
       </w:r>
       <w:r>
-        <w:t xml:space="preserve"> Driver cancels → system applies the cancellation policy → refund is issued through the gateway → the space returns to live inventory. </w:t>
+        <w:t xml:space="preserve"> Driver opens history → system lists past and upcoming reservations → driver downloads a PDF receipt. </w:t>
+      </w:r>
+      <w:r>
+        <w:rPr>
+          <w:b/>
+          <w:bCs/>
+        </w:rPr>
+        <w:t>Postcondition:</w:t>
+      </w:r>
+      <w:r>
+        <w:t xml:space="preserve"> Receipt is downloaded or emailed.</w:t>
+      </w:r>
+    </w:p>
+    <w:p>
+      <w:pPr>
+        <w:pStyle w:val="Heading4"/>
+      </w:pPr>
+      <w:bookmarkStart w:id="61" w:name="uc-16-receive-notifications-and-alerts"/>
+      <w:bookmarkEnd w:id="60"/>
+      <w:r>
+        <w:t>UC-16 — Receive Notifications and Alerts</w:t>
+      </w:r>
+    </w:p>
+    <w:p>
+      <w:pPr>
+        <w:pStyle w:val="FirstParagraph"/>
+      </w:pPr>
+      <w:r>
+        <w:rPr>
+          <w:b/>
+          <w:bCs/>
+        </w:rPr>
+        <w:t>Actor:</w:t>
+      </w:r>
+      <w:r>
+        <w:t xml:space="preserve"> Driver </w:t>
+      </w:r>
+      <w:r>
+        <w:rPr>
+          <w:b/>
+          <w:bCs/>
+        </w:rPr>
+        <w:t>Goal:</w:t>
+      </w:r>
+      <w:r>
+        <w:t xml:space="preserve"> Be reminded before something goes wrong. </w:t>
+      </w:r>
+      <w:r>
+        <w:rPr>
+          <w:b/>
+          <w:bCs/>
+        </w:rPr>
+        <w:t>Preconditions:</w:t>
+      </w:r>
+      <w:r>
+        <w:t xml:space="preserve"> Notifications are enabled. </w:t>
+      </w:r>
+      <w:r>
+        <w:rPr>
+          <w:b/>
+          <w:bCs/>
+        </w:rPr>
+        <w:t>Main flow:</w:t>
+      </w:r>
+      <w:r>
+        <w:t xml:space="preserve"> System sends reservation confirmations, arrival reminders, expiration warnings before the reservation ends, and disruption alerts if a garage becomes unavailable. </w:t>
       </w:r>
       <w:r>
         <w:rPr>
@@ -6305,7 +6500,7 @@
         <w:t>Alternate flow:</w:t>
       </w:r>
       <w:r>
-        <w:t xml:space="preserve"> Cancellation is inside the no-refund window → system states the policy and asks for confirmation before cancelling without refund. </w:t>
+        <w:t xml:space="preserve"> Push notifications are disabled → system falls back to email or SMS. </w:t>
       </w:r>
       <w:r>
         <w:rPr>
@@ -6315,17 +6510,17 @@
         <w:t>Postcondition:</w:t>
       </w:r>
       <w:r>
-        <w:t xml:space="preserve"> Reservation is cancelled; inventory and finances are consistent.</w:t>
+        <w:t xml:space="preserve"> Driver is informed in time to act.</w:t>
       </w:r>
     </w:p>
     <w:p>
       <w:pPr>
         <w:pStyle w:val="Heading4"/>
       </w:pPr>
-      <w:bookmarkStart w:id="61" w:name="X4ec992de1f5d66f492af412891f09aa5ac04e15"/>
-      <w:bookmarkEnd w:id="60"/>
-      <w:r>
-        <w:t>UC-15 — View Reservation History and Receipts</w:t>
+      <w:bookmarkStart w:id="62" w:name="uc-17-manage-garage-listing-and-capacity"/>
+      <w:bookmarkEnd w:id="61"/>
+      <w:r>
+        <w:t>UC-17 — Manage Garage Listing and Capacity</w:t>
       </w:r>
     </w:p>
     <w:p>
@@ -6340,7 +6535,7 @@
         <w:t>Actor:</w:t>
       </w:r>
       <w:r>
-        <w:t xml:space="preserve"> Driver </w:t>
+        <w:t xml:space="preserve"> Operator </w:t>
       </w:r>
       <w:r>
         <w:rPr>
@@ -6350,7 +6545,7 @@
         <w:t>Goal:</w:t>
       </w:r>
       <w:r>
-        <w:t xml:space="preserve"> Look up past parking and download receipts for expenses. </w:t>
+        <w:t xml:space="preserve"> Keep the garage’s information and inventory correct. </w:t>
       </w:r>
       <w:r>
         <w:rPr>
@@ -6360,7 +6555,7 @@
         <w:t>Preconditions:</w:t>
       </w:r>
       <w:r>
-        <w:t xml:space="preserve"> Driver is logged in with at least one past reservation. </w:t>
+        <w:t xml:space="preserve"> Operator account is verified and linked to a garage. </w:t>
       </w:r>
       <w:r>
         <w:rPr>
@@ -6370,7 +6565,17 @@
         <w:t>Main flow:</w:t>
       </w:r>
       <w:r>
-        <w:t xml:space="preserve"> Driver opens history → system lists past and upcoming reservations → driver downloads a PDF receipt. </w:t>
+        <w:t xml:space="preserve"> Operator edits address, hours, photos, clearance, total spaces, and reservable space count → system validates and publishes the changes. </w:t>
+      </w:r>
+      <w:r>
+        <w:rPr>
+          <w:b/>
+          <w:bCs/>
+        </w:rPr>
+        <w:t>Alternate flow:</w:t>
+      </w:r>
+      <w:r>
+        <w:t xml:space="preserve"> Capacity is reduced below the number of existing reservations → system blocks the change and lists the affected reservations. </w:t>
       </w:r>
       <w:r>
         <w:rPr>
@@ -6380,165 +6585,15 @@
         <w:t>Postcondition:</w:t>
       </w:r>
       <w:r>
-        <w:t xml:space="preserve"> Receipt is downloaded or emailed.</w:t>
+        <w:t xml:space="preserve"> Listing is live and consistent with existing reservations.</w:t>
       </w:r>
     </w:p>
     <w:p>
       <w:pPr>
         <w:pStyle w:val="Heading4"/>
       </w:pPr>
-      <w:bookmarkStart w:id="62" w:name="uc-16-receive-notifications-and-alerts"/>
-      <w:bookmarkEnd w:id="61"/>
-      <w:r>
-        <w:t>UC-16 — Receive Notifications and Alerts</w:t>
-      </w:r>
-    </w:p>
-    <w:p>
-      <w:pPr>
-        <w:pStyle w:val="FirstParagraph"/>
-      </w:pPr>
-      <w:r>
-        <w:rPr>
-          <w:b/>
-          <w:bCs/>
-        </w:rPr>
-        <w:t>Actor:</w:t>
-      </w:r>
-      <w:r>
-        <w:t xml:space="preserve"> Driver </w:t>
-      </w:r>
-      <w:r>
-        <w:rPr>
-          <w:b/>
-          <w:bCs/>
-        </w:rPr>
-        <w:t>Goal:</w:t>
-      </w:r>
-      <w:r>
-        <w:t xml:space="preserve"> Be reminded before something goes wrong. </w:t>
-      </w:r>
-      <w:r>
-        <w:rPr>
-          <w:b/>
-          <w:bCs/>
-        </w:rPr>
-        <w:t>Preconditions:</w:t>
-      </w:r>
-      <w:r>
-        <w:t xml:space="preserve"> Notifications are enabled. </w:t>
-      </w:r>
-      <w:r>
-        <w:rPr>
-          <w:b/>
-          <w:bCs/>
-        </w:rPr>
-        <w:t>Main flow:</w:t>
-      </w:r>
-      <w:r>
-        <w:t xml:space="preserve"> System sends reservation confirmations, arrival reminders, expiration warnings before the reservation ends, and disruption alerts if a garage becomes unavailable. </w:t>
-      </w:r>
-      <w:r>
-        <w:rPr>
-          <w:b/>
-          <w:bCs/>
-        </w:rPr>
-        <w:t>Alternate flow:</w:t>
-      </w:r>
-      <w:r>
-        <w:t xml:space="preserve"> Push notifications are disabled → system falls back to email or SMS. </w:t>
-      </w:r>
-      <w:r>
-        <w:rPr>
-          <w:b/>
-          <w:bCs/>
-        </w:rPr>
-        <w:t>Postcondition:</w:t>
-      </w:r>
-      <w:r>
-        <w:t xml:space="preserve"> Driver is informed in time to act.</w:t>
-      </w:r>
-    </w:p>
-    <w:p>
-      <w:pPr>
-        <w:pStyle w:val="Heading4"/>
-      </w:pPr>
-      <w:bookmarkStart w:id="63" w:name="uc-17-manage-garage-listing-and-capacity"/>
+      <w:bookmarkStart w:id="63" w:name="uc-18-set-and-adjust-pricing"/>
       <w:bookmarkEnd w:id="62"/>
-      <w:r>
-        <w:t>UC-17 — Manage Garage Listing and Capacity</w:t>
-      </w:r>
-    </w:p>
-    <w:p>
-      <w:pPr>
-        <w:pStyle w:val="FirstParagraph"/>
-      </w:pPr>
-      <w:r>
-        <w:rPr>
-          <w:b/>
-          <w:bCs/>
-        </w:rPr>
-        <w:t>Actor:</w:t>
-      </w:r>
-      <w:r>
-        <w:t xml:space="preserve"> Operator </w:t>
-      </w:r>
-      <w:r>
-        <w:rPr>
-          <w:b/>
-          <w:bCs/>
-        </w:rPr>
-        <w:t>Goal:</w:t>
-      </w:r>
-      <w:r>
-        <w:t xml:space="preserve"> Keep the garage’s information and inventory correct. </w:t>
-      </w:r>
-      <w:r>
-        <w:rPr>
-          <w:b/>
-          <w:bCs/>
-        </w:rPr>
-        <w:t>Preconditions:</w:t>
-      </w:r>
-      <w:r>
-        <w:t xml:space="preserve"> Operator account is verified and linked to a garage. </w:t>
-      </w:r>
-      <w:r>
-        <w:rPr>
-          <w:b/>
-          <w:bCs/>
-        </w:rPr>
-        <w:t>Main flow:</w:t>
-      </w:r>
-      <w:r>
-        <w:t xml:space="preserve"> Operator edits address, hours, photos, clearance, total spaces, and reservable space count → system validates and publishes the changes. </w:t>
-      </w:r>
-      <w:r>
-        <w:rPr>
-          <w:b/>
-          <w:bCs/>
-        </w:rPr>
-        <w:t>Alternate flow:</w:t>
-      </w:r>
-      <w:r>
-        <w:t xml:space="preserve"> Capacity is reduced below the number of existing reservations → system blocks the change and lists the affected reservations. </w:t>
-      </w:r>
-      <w:r>
-        <w:rPr>
-          <w:b/>
-          <w:bCs/>
-        </w:rPr>
-        <w:t>Postcondition:</w:t>
-      </w:r>
-      <w:r>
-        <w:t xml:space="preserve"> Listing is live and consistent with existing reservations.</w:t>
-      </w:r>
-    </w:p>
-    <w:p>
-      <w:pPr>
-        <w:pStyle w:val="Heading4"/>
-      </w:pPr>
-      <w:bookmarkStart w:id="64" w:name="uc-18-set-and-adjust-pricing"/>
-      <w:bookmarkEnd w:id="63"/>
       <w:r>
         <w:t>UC-18 — Set and Adjust Pricing</w:t>
       </w:r>
@@ -6616,10 +6671,85 @@
       <w:pPr>
         <w:pStyle w:val="Heading4"/>
       </w:pPr>
-      <w:bookmarkStart w:id="65" w:name="uc-19-monitor-live-occupancy-dashboard"/>
+      <w:bookmarkStart w:id="64" w:name="uc-19-monitor-live-occupancy-dashboard"/>
+      <w:bookmarkEnd w:id="63"/>
+      <w:r>
+        <w:t>UC-19 — Monitor Live Occupancy Dashboard</w:t>
+      </w:r>
+    </w:p>
+    <w:p>
+      <w:pPr>
+        <w:pStyle w:val="FirstParagraph"/>
+      </w:pPr>
+      <w:r>
+        <w:rPr>
+          <w:b/>
+          <w:bCs/>
+        </w:rPr>
+        <w:t>Actor:</w:t>
+      </w:r>
+      <w:r>
+        <w:t xml:space="preserve"> Operator </w:t>
+      </w:r>
+      <w:r>
+        <w:rPr>
+          <w:b/>
+          <w:bCs/>
+        </w:rPr>
+        <w:t>Goal:</w:t>
+      </w:r>
+      <w:r>
+        <w:t xml:space="preserve"> See what is happening in the garage right now. </w:t>
+      </w:r>
+      <w:r>
+        <w:rPr>
+          <w:b/>
+          <w:bCs/>
+        </w:rPr>
+        <w:t>Preconditions:</w:t>
+      </w:r>
+      <w:r>
+        <w:t xml:space="preserve"> Operator is logged in; the garage has a live feed. </w:t>
+      </w:r>
+      <w:r>
+        <w:rPr>
+          <w:b/>
+          <w:bCs/>
+        </w:rPr>
+        <w:t>Main flow:</w:t>
+      </w:r>
+      <w:r>
+        <w:t xml:space="preserve"> Dashboard displays current occupancy, spaces reserved versus walk-in, entries and exits, and revenue so far today, refreshing continuously. </w:t>
+      </w:r>
+      <w:r>
+        <w:rPr>
+          <w:b/>
+          <w:bCs/>
+        </w:rPr>
+        <w:t>Alternate flow:</w:t>
+      </w:r>
+      <w:r>
+        <w:t xml:space="preserve"> Hardware feed drops → dashboard shows a stale-data warning with the last update time. </w:t>
+      </w:r>
+      <w:r>
+        <w:rPr>
+          <w:b/>
+          <w:bCs/>
+        </w:rPr>
+        <w:t>Postcondition:</w:t>
+      </w:r>
+      <w:r>
+        <w:t xml:space="preserve"> Operator has an accurate live picture.</w:t>
+      </w:r>
+    </w:p>
+    <w:p>
+      <w:pPr>
+        <w:pStyle w:val="Heading4"/>
+      </w:pPr>
+      <w:bookmarkStart w:id="65" w:name="X8bf64e7550397b9ab0c3a6bed710f623e6cfce6"/>
       <w:bookmarkEnd w:id="64"/>
       <w:r>
-        <w:t>UC-19 — Monitor Live Occupancy Dashboard</w:t>
+        <w:t>UC-20 — Generate Occupancy and Revenue Reports</w:t>
       </w:r>
     </w:p>
     <w:p>
@@ -6634,7 +6764,7 @@
         <w:t>Actor:</w:t>
       </w:r>
       <w:r>
-        <w:t xml:space="preserve"> Operator </w:t>
+        <w:t xml:space="preserve"> Operator, Finance User </w:t>
       </w:r>
       <w:r>
         <w:rPr>
@@ -6644,7 +6774,7 @@
         <w:t>Goal:</w:t>
       </w:r>
       <w:r>
-        <w:t xml:space="preserve"> See what is happening in the garage right now. </w:t>
+        <w:t xml:space="preserve"> Analyze utilization and revenue over a period. </w:t>
       </w:r>
       <w:r>
         <w:rPr>
@@ -6654,7 +6784,7 @@
         <w:t>Preconditions:</w:t>
       </w:r>
       <w:r>
-        <w:t xml:space="preserve"> Operator is logged in; the garage has a live feed. </w:t>
+        <w:t xml:space="preserve"> Historical data exists for the selected range. </w:t>
       </w:r>
       <w:r>
         <w:rPr>
@@ -6664,7 +6794,7 @@
         <w:t>Main flow:</w:t>
       </w:r>
       <w:r>
-        <w:t xml:space="preserve"> Dashboard displays current occupancy, spaces reserved versus walk-in, entries and exits, and revenue so far today, refreshing continuously. </w:t>
+        <w:t xml:space="preserve"> User selects a date range and garages → system generates utilization rate, peak hours, average duration, and revenue → user exports to PDF or CSV. </w:t>
       </w:r>
       <w:r>
         <w:rPr>
@@ -6674,7 +6804,7 @@
         <w:t>Alternate flow:</w:t>
       </w:r>
       <w:r>
-        <w:t xml:space="preserve"> Hardware feed drops → dashboard shows a stale-data warning with the last update time. </w:t>
+        <w:t xml:space="preserve"> Range exceeds retention limits → system caps the range and explains why. </w:t>
       </w:r>
       <w:r>
         <w:rPr>
@@ -6684,17 +6814,17 @@
         <w:t>Postcondition:</w:t>
       </w:r>
       <w:r>
-        <w:t xml:space="preserve"> Operator has an accurate live picture.</w:t>
+        <w:t xml:space="preserve"> Report is generated and exported.</w:t>
       </w:r>
     </w:p>
     <w:p>
       <w:pPr>
         <w:pStyle w:val="Heading4"/>
       </w:pPr>
-      <w:bookmarkStart w:id="66" w:name="X8bf64e7550397b9ab0c3a6bed710f623e6cfce6"/>
+      <w:bookmarkStart w:id="66" w:name="uc-21-process-operator-payouts"/>
       <w:bookmarkEnd w:id="65"/>
       <w:r>
-        <w:t>UC-20 — Generate Occupancy and Revenue Reports</w:t>
+        <w:t>UC-21 — Process Operator Payouts</w:t>
       </w:r>
     </w:p>
     <w:p>
@@ -6709,7 +6839,7 @@
         <w:t>Actor:</w:t>
       </w:r>
       <w:r>
-        <w:t xml:space="preserve"> Operator, Finance User </w:t>
+        <w:t xml:space="preserve"> Finance User, Payment Gateway </w:t>
       </w:r>
       <w:r>
         <w:rPr>
@@ -6719,7 +6849,7 @@
         <w:t>Goal:</w:t>
       </w:r>
       <w:r>
-        <w:t xml:space="preserve"> Analyze utilization and revenue over a period. </w:t>
+        <w:t xml:space="preserve"> Pay operators their share on schedule. </w:t>
       </w:r>
       <w:r>
         <w:rPr>
@@ -6729,7 +6859,7 @@
         <w:t>Preconditions:</w:t>
       </w:r>
       <w:r>
-        <w:t xml:space="preserve"> Historical data exists for the selected range. </w:t>
+        <w:t xml:space="preserve"> Completed, settled reservations exist for the payout period. </w:t>
       </w:r>
       <w:r>
         <w:rPr>
@@ -6739,7 +6869,7 @@
         <w:t>Main flow:</w:t>
       </w:r>
       <w:r>
-        <w:t xml:space="preserve"> User selects a date range and garages → system generates utilization rate, peak hours, average duration, and revenue → user exports to PDF or CSV. </w:t>
+        <w:t xml:space="preserve"> System calculates gross revenue minus platform fee and refunds per operator → Finance User reviews and approves → payout is sent through the gateway. </w:t>
       </w:r>
       <w:r>
         <w:rPr>
@@ -6749,7 +6879,7 @@
         <w:t>Alternate flow:</w:t>
       </w:r>
       <w:r>
-        <w:t xml:space="preserve"> Range exceeds retention limits → system caps the range and explains why. </w:t>
+        <w:t xml:space="preserve"> A discrepancy is found → the payout is held and flagged for reconciliation. </w:t>
       </w:r>
       <w:r>
         <w:rPr>
@@ -6759,17 +6889,17 @@
         <w:t>Postcondition:</w:t>
       </w:r>
       <w:r>
-        <w:t xml:space="preserve"> Report is generated and exported.</w:t>
+        <w:t xml:space="preserve"> Operators are paid and the payout is recorded.</w:t>
       </w:r>
     </w:p>
     <w:p>
       <w:pPr>
         <w:pStyle w:val="Heading4"/>
       </w:pPr>
-      <w:bookmarkStart w:id="67" w:name="uc-21-process-operator-payouts"/>
+      <w:bookmarkStart w:id="67" w:name="uc-22-manage-users-and-resolve-disputes"/>
       <w:bookmarkEnd w:id="66"/>
       <w:r>
-        <w:t>UC-21 — Process Operator Payouts</w:t>
+        <w:t>UC-22 — Manage Users and Resolve Disputes</w:t>
       </w:r>
     </w:p>
     <w:p>
@@ -6784,7 +6914,7 @@
         <w:t>Actor:</w:t>
       </w:r>
       <w:r>
-        <w:t xml:space="preserve"> Finance User, Payment Gateway </w:t>
+        <w:t xml:space="preserve"> System Administrator </w:t>
       </w:r>
       <w:r>
         <w:rPr>
@@ -6794,7 +6924,7 @@
         <w:t>Goal:</w:t>
       </w:r>
       <w:r>
-        <w:t xml:space="preserve"> Pay operators their share on schedule. </w:t>
+        <w:t xml:space="preserve"> Keep accounts healthy and settle problems fairly. </w:t>
       </w:r>
       <w:r>
         <w:rPr>
@@ -6804,7 +6934,7 @@
         <w:t>Preconditions:</w:t>
       </w:r>
       <w:r>
-        <w:t xml:space="preserve"> Completed, settled reservations exist for the payout period. </w:t>
+        <w:t xml:space="preserve"> Administrator is logged in with elevated permissions. </w:t>
       </w:r>
       <w:r>
         <w:rPr>
@@ -6814,7 +6944,7 @@
         <w:t>Main flow:</w:t>
       </w:r>
       <w:r>
-        <w:t xml:space="preserve"> System calculates gross revenue minus platform fee and refunds per operator → Finance User reviews and approves → payout is sent through the gateway. </w:t>
+        <w:t xml:space="preserve"> Administrator searches for an account, reviews reservation and entry logs, and takes action — issue a goodwill refund, correct a record, suspend an account, or resolve a duplicate plate claim. </w:t>
       </w:r>
       <w:r>
         <w:rPr>
@@ -6824,7 +6954,7 @@
         <w:t>Alternate flow:</w:t>
       </w:r>
       <w:r>
-        <w:t xml:space="preserve"> A discrepancy is found → the payout is held and flagged for reconciliation. </w:t>
+        <w:t xml:space="preserve"> The dispute involves a failed gate entry → administrator pulls the hardware incident log before deciding. </w:t>
       </w:r>
       <w:r>
         <w:rPr>
@@ -6834,96 +6964,24 @@
         <w:t>Postcondition:</w:t>
       </w:r>
       <w:r>
-        <w:t xml:space="preserve"> Operators are paid and the payout is recorded.</w:t>
-      </w:r>
-    </w:p>
-    <w:p>
-      <w:pPr>
-        <w:pStyle w:val="Heading4"/>
-      </w:pPr>
-      <w:bookmarkStart w:id="68" w:name="uc-22-manage-users-and-resolve-disputes"/>
+        <w:t xml:space="preserve"> The dispute is resolved </w:t>
+      </w:r>
+      <w:r>
+        <w:t>and every action is written to an audit trail.</w:t>
+      </w:r>
+    </w:p>
+    <w:p>
+      <w:pPr>
+        <w:pStyle w:val="Heading3"/>
+      </w:pPr>
+      <w:bookmarkStart w:id="68" w:name="non-functional-requirements"/>
+      <w:bookmarkStart w:id="69" w:name="_Toc239958279"/>
+      <w:bookmarkEnd w:id="44"/>
       <w:bookmarkEnd w:id="67"/>
       <w:r>
-        <w:t>UC-22 — Manage Users and Resolve Disputes</w:t>
-      </w:r>
-    </w:p>
-    <w:p>
-      <w:pPr>
-        <w:pStyle w:val="FirstParagraph"/>
-      </w:pPr>
-      <w:r>
-        <w:rPr>
-          <w:b/>
-          <w:bCs/>
-        </w:rPr>
-        <w:t>Actor:</w:t>
-      </w:r>
-      <w:r>
-        <w:t xml:space="preserve"> System Administrator </w:t>
-      </w:r>
-      <w:r>
-        <w:rPr>
-          <w:b/>
-          <w:bCs/>
-        </w:rPr>
-        <w:t>Goal:</w:t>
-      </w:r>
-      <w:r>
-        <w:t xml:space="preserve"> Keep accounts healthy and settle problems fairly. </w:t>
-      </w:r>
-      <w:r>
-        <w:rPr>
-          <w:b/>
-          <w:bCs/>
-        </w:rPr>
-        <w:t>Preconditions:</w:t>
-      </w:r>
-      <w:r>
-        <w:t xml:space="preserve"> Administrator is logged in with elevated permissions. </w:t>
-      </w:r>
-      <w:r>
-        <w:rPr>
-          <w:b/>
-          <w:bCs/>
-        </w:rPr>
-        <w:t>Main flow:</w:t>
-      </w:r>
-      <w:r>
-        <w:t xml:space="preserve"> Administrator searches for an account, reviews reservation and entry logs, and takes action — issue a goodwill refund, correct a record, suspend an account, or resolve a duplicate plate claim. </w:t>
-      </w:r>
-      <w:r>
-        <w:rPr>
-          <w:b/>
-          <w:bCs/>
-        </w:rPr>
-        <w:t>Alternate flow:</w:t>
-      </w:r>
-      <w:r>
-        <w:t xml:space="preserve"> The dispute involves a failed gate entry → administrator pulls the hardware incident log before deciding. </w:t>
-      </w:r>
-      <w:r>
-        <w:rPr>
-          <w:b/>
-          <w:bCs/>
-        </w:rPr>
-        <w:t>Postcondition:</w:t>
-      </w:r>
-      <w:r>
-        <w:t xml:space="preserve"> The dispute is resolved and every action is written to an audit trail.</w:t>
-      </w:r>
-    </w:p>
-    <w:p>
-      <w:pPr>
-        <w:pStyle w:val="Heading3"/>
-      </w:pPr>
-      <w:bookmarkStart w:id="69" w:name="non-functional-requirements"/>
-      <w:bookmarkStart w:id="70" w:name="_Toc239955062"/>
-      <w:bookmarkEnd w:id="45"/>
-      <w:bookmarkEnd w:id="68"/>
-      <w:r>
         <w:t>4.5 Non-Functional Requirements</w:t>
       </w:r>
-      <w:bookmarkEnd w:id="70"/>
+      <w:bookmarkEnd w:id="69"/>
     </w:p>
     <w:tbl>
       <w:tblPr>
@@ -7479,13 +7537,13 @@
       <w:pPr>
         <w:pStyle w:val="Heading3"/>
       </w:pPr>
-      <w:bookmarkStart w:id="71" w:name="external-interfaces"/>
-      <w:bookmarkStart w:id="72" w:name="_Toc239955063"/>
-      <w:bookmarkEnd w:id="69"/>
+      <w:bookmarkStart w:id="70" w:name="external-interfaces"/>
+      <w:bookmarkStart w:id="71" w:name="_Toc239958280"/>
+      <w:bookmarkEnd w:id="68"/>
       <w:r>
         <w:t>4.6 External Interfaces</w:t>
       </w:r>
-      <w:bookmarkEnd w:id="72"/>
+      <w:bookmarkEnd w:id="71"/>
     </w:p>
     <w:tbl>
       <w:tblPr>
@@ -7753,13 +7811,13 @@
       <w:pPr>
         <w:pStyle w:val="Heading3"/>
       </w:pPr>
-      <w:bookmarkStart w:id="73" w:name="open-items-for-future-versions"/>
-      <w:bookmarkStart w:id="74" w:name="_Toc239955064"/>
-      <w:bookmarkEnd w:id="71"/>
+      <w:bookmarkStart w:id="72" w:name="open-items-for-future-versions"/>
+      <w:bookmarkStart w:id="73" w:name="_Toc239958281"/>
+      <w:bookmarkEnd w:id="70"/>
       <w:r>
         <w:t>4.7 Open Items for Future Versions</w:t>
       </w:r>
-      <w:bookmarkEnd w:id="74"/>
+      <w:bookmarkEnd w:id="73"/>
     </w:p>
     <w:p>
       <w:pPr>
@@ -7858,14 +7916,14 @@
       <w:pPr>
         <w:pStyle w:val="Heading2"/>
       </w:pPr>
-      <w:bookmarkStart w:id="75" w:name="next-steps"/>
-      <w:bookmarkStart w:id="76" w:name="_Toc239955065"/>
-      <w:bookmarkEnd w:id="37"/>
-      <w:bookmarkEnd w:id="73"/>
+      <w:bookmarkStart w:id="74" w:name="next-steps"/>
+      <w:bookmarkStart w:id="75" w:name="_Toc239958282"/>
+      <w:bookmarkEnd w:id="36"/>
+      <w:bookmarkEnd w:id="72"/>
       <w:r>
         <w:t>5. Next Steps</w:t>
       </w:r>
-      <w:bookmarkEnd w:id="76"/>
+      <w:bookmarkEnd w:id="75"/>
     </w:p>
     <w:p>
       <w:pPr>
@@ -7919,13 +7977,13 @@
       <w:pPr>
         <w:pStyle w:val="Heading2"/>
       </w:pPr>
-      <w:bookmarkStart w:id="77" w:name="references"/>
-      <w:bookmarkStart w:id="78" w:name="_Toc239955066"/>
-      <w:bookmarkEnd w:id="75"/>
+      <w:bookmarkStart w:id="76" w:name="references"/>
+      <w:bookmarkStart w:id="77" w:name="_Toc239958283"/>
+      <w:bookmarkEnd w:id="74"/>
       <w:r>
         <w:t>6. References</w:t>
       </w:r>
-      <w:bookmarkEnd w:id="78"/>
+      <w:bookmarkEnd w:id="77"/>
     </w:p>
     <w:p>
       <w:pPr>
@@ -8049,7 +8107,7 @@
         <w:t>End of document — version 1.0</w:t>
       </w:r>
       <w:bookmarkEnd w:id="0"/>
-      <w:bookmarkEnd w:id="77"/>
+      <w:bookmarkEnd w:id="76"/>
     </w:p>
     <w:sectPr>
       <w:headerReference w:type="default" r:id="rId7"/>
@@ -9037,6 +9095,7 @@
   <w:style w:type="character" w:default="1" w:styleId="DefaultParagraphFont">
     <w:name w:val="Default Paragraph Font"/>
     <w:uiPriority w:val="1"/>
+    <w:semiHidden/>
     <w:unhideWhenUsed/>
   </w:style>
   <w:style w:type="table" w:default="1" w:styleId="TableNormal">

</xml_diff>